<commit_message>
Align Bambang design documents and Lucidchart diagrams with SRS
</commit_message>
<xml_diff>
--- a/docs/diagrams/minggu5_erd_draft_auth_event.docx
+++ b/docs/diagrams/minggu5_erd_draft_auth_event.docx
@@ -1450,100 +1450,61 @@
       </w:pPr>
       <w:proofErr w:type="spellStart"/>
       <w:r>
-        <w:t>Termasuk</w:t>
-      </w:r>
-      <w:proofErr w:type="spellEnd"/>
-      <w:r>
-        <w:t xml:space="preserve">: </w:t>
-      </w:r>
-      <w:proofErr w:type="spellStart"/>
-      <w:r>
-        <w:t>entitas</w:t>
-      </w:r>
-      <w:proofErr w:type="spellEnd"/>
-      <w:r>
-        <w:t xml:space="preserve"> </w:t>
-      </w:r>
+        <w:t>Termasuk: User dan Organization pada modul Auth serta Event dan EventCategory pada modul Event. Organization diperlukan untuk verifikasi penyelenggara dan batas kepemilikan organisasi sesuai FR-AUTH-05, FR-EVT-05 dan FR-ADM-02.</w:t>
+      </w:r>
+      <w:proofErr w:type="spellEnd"/>
+      <w:r/>
+      <w:proofErr w:type="spellStart"/>
+      <w:r/>
+      <w:proofErr w:type="spellEnd"/>
+      <w:r/>
       <w:r>
         <w:rPr>
           <w:i/>
           <w:iCs/>
         </w:rPr>
-        <w:t>User</w:t>
-      </w:r>
-      <w:r>
-        <w:t xml:space="preserve"> (Auth), </w:t>
-      </w:r>
+      </w:r>
+      <w:r/>
       <w:r>
         <w:rPr>
           <w:i/>
           <w:iCs/>
         </w:rPr>
-        <w:t>Event</w:t>
-      </w:r>
-      <w:r>
-        <w:t xml:space="preserve">, dan </w:t>
-      </w:r>
+      </w:r>
+      <w:r/>
       <w:proofErr w:type="spellStart"/>
       <w:r>
         <w:rPr>
           <w:i/>
           <w:iCs/>
         </w:rPr>
-        <w:t>EventCategory</w:t>
-      </w:r>
-      <w:proofErr w:type="spellEnd"/>
-      <w:r>
-        <w:t xml:space="preserve"> (lookup </w:t>
-      </w:r>
-      <w:proofErr w:type="spellStart"/>
-      <w:r>
-        <w:t>kategori</w:t>
-      </w:r>
-      <w:proofErr w:type="spellEnd"/>
-      <w:r>
-        <w:t xml:space="preserve"> yang </w:t>
-      </w:r>
-      <w:proofErr w:type="spellStart"/>
-      <w:r>
-        <w:t>mendukung</w:t>
-      </w:r>
-      <w:proofErr w:type="spellEnd"/>
-      <w:r>
-        <w:t xml:space="preserve"> </w:t>
-      </w:r>
-      <w:proofErr w:type="spellStart"/>
-      <w:r>
-        <w:t>pencarian</w:t>
-      </w:r>
-      <w:proofErr w:type="spellEnd"/>
-      <w:r>
-        <w:t xml:space="preserve">/filter pada US-EVENT-05 dan </w:t>
-      </w:r>
-      <w:proofErr w:type="spellStart"/>
-      <w:r>
-        <w:t>kebutuhan</w:t>
-      </w:r>
-      <w:proofErr w:type="spellEnd"/>
-      <w:r>
-        <w:t xml:space="preserve"> </w:t>
-      </w:r>
-      <w:proofErr w:type="spellStart"/>
-      <w:r>
-        <w:t>indeks</w:t>
-      </w:r>
-      <w:proofErr w:type="spellEnd"/>
-      <w:r>
-        <w:t xml:space="preserve"> </w:t>
-      </w:r>
-      <w:proofErr w:type="spellStart"/>
-      <w:r>
-        <w:t>pencarian</w:t>
-      </w:r>
-      <w:proofErr w:type="spellEnd"/>
-      <w:r>
-        <w:t xml:space="preserve"> NFR-SCAL-02).</w:t>
-      </w:r>
+      </w:r>
+      <w:proofErr w:type="spellEnd"/>
+      <w:r/>
+      <w:proofErr w:type="spellStart"/>
+      <w:r/>
+      <w:proofErr w:type="spellEnd"/>
+      <w:r/>
+      <w:proofErr w:type="spellStart"/>
+      <w:r/>
+      <w:proofErr w:type="spellEnd"/>
+      <w:r/>
+      <w:proofErr w:type="spellStart"/>
+      <w:r/>
+      <w:proofErr w:type="spellEnd"/>
+      <w:r/>
+      <w:proofErr w:type="spellStart"/>
+      <w:r/>
+      <w:proofErr w:type="spellEnd"/>
+      <w:r/>
+      <w:proofErr w:type="spellStart"/>
+      <w:r/>
+      <w:proofErr w:type="spellEnd"/>
+      <w:r/>
+      <w:proofErr w:type="spellStart"/>
+      <w:r/>
+      <w:proofErr w:type="spellEnd"/>
+      <w:r/>
     </w:p>
     <w:p>
       <w:pPr>
@@ -1938,6 +1899,8 @@
         </w:tblPrEx>
         <w:trPr>
           <w:tblHeader/>
+          <w:cantSplit/>
+          <w:tblHeader/>
         </w:trPr>
         <w:tc>
           <w:tcPr>
@@ -2054,6 +2017,9 @@
             <w:bottom w:w="0" w:type="dxa"/>
           </w:tblCellMar>
         </w:tblPrEx>
+        <w:trPr>
+          <w:cantSplit/>
+        </w:trPr>
         <w:tc>
           <w:tcPr>
             <w:tcW w:w="2200" w:type="dxa"/>
@@ -2072,15 +2038,14 @@
           </w:tcPr>
           <w:p>
             <w:pPr>
-              <w:jc w:val="both"/>
-            </w:pPr>
-            <w:proofErr w:type="spellStart"/>
-            <w:r>
-              <w:t>user_id</w:t>
-            </w:r>
-            <w:proofErr w:type="spellEnd"/>
-            <w:r>
-              <w:t xml:space="preserve"> (PK)</w:t>
+              <w:spacing w:after="60"/>
+            </w:pPr>
+            <w:r>
+              <w:rPr>
+                <w:rFonts w:ascii="Times New Roman" w:hAnsi="Times New Roman"/>
+                <w:sz w:val="20"/>
+              </w:rPr>
+              <w:t>user_id (PK)</w:t>
             </w:r>
           </w:p>
         </w:tc>
@@ -2102,10 +2067,14 @@
           </w:tcPr>
           <w:p>
             <w:pPr>
-              <w:jc w:val="both"/>
-            </w:pPr>
-            <w:r>
-              <w:t>UUID / BIGINT</w:t>
+              <w:spacing w:after="60"/>
+            </w:pPr>
+            <w:r>
+              <w:rPr>
+                <w:rFonts w:ascii="Times New Roman" w:hAnsi="Times New Roman"/>
+                <w:sz w:val="20"/>
+              </w:rPr>
+              <w:t>Id</w:t>
             </w:r>
           </w:p>
         </w:tc>
@@ -2127,34 +2096,14 @@
           </w:tcPr>
           <w:p>
             <w:pPr>
-              <w:jc w:val="both"/>
-            </w:pPr>
-            <w:r>
-              <w:t xml:space="preserve">Primary key, </w:t>
-            </w:r>
-            <w:proofErr w:type="spellStart"/>
-            <w:r>
-              <w:t>dibuat</w:t>
-            </w:r>
-            <w:proofErr w:type="spellEnd"/>
-            <w:r>
-              <w:t xml:space="preserve"> </w:t>
-            </w:r>
-            <w:proofErr w:type="spellStart"/>
-            <w:r>
-              <w:t>otomatis</w:t>
-            </w:r>
-            <w:proofErr w:type="spellEnd"/>
-            <w:r>
-              <w:t xml:space="preserve"> oleh </w:t>
-            </w:r>
-            <w:proofErr w:type="spellStart"/>
-            <w:r>
-              <w:t>sistem</w:t>
-            </w:r>
-            <w:proofErr w:type="spellEnd"/>
-            <w:r>
-              <w:t>.</w:t>
+              <w:spacing w:after="60"/>
+            </w:pPr>
+            <w:r>
+              <w:rPr>
+                <w:rFonts w:ascii="Times New Roman" w:hAnsi="Times New Roman"/>
+                <w:sz w:val="20"/>
+              </w:rPr>
+              <w:t>Primary key; tipe fisik PK/FK diputuskan saat implementasi.</w:t>
             </w:r>
           </w:p>
         </w:tc>
@@ -2166,6 +2115,9 @@
             <w:bottom w:w="0" w:type="dxa"/>
           </w:tblCellMar>
         </w:tblPrEx>
+        <w:trPr>
+          <w:cantSplit/>
+        </w:trPr>
         <w:tc>
           <w:tcPr>
             <w:tcW w:w="2200" w:type="dxa"/>
@@ -2184,10 +2136,14 @@
           </w:tcPr>
           <w:p>
             <w:pPr>
-              <w:jc w:val="both"/>
-            </w:pPr>
-            <w:r>
-              <w:t>name</w:t>
+              <w:spacing w:after="60"/>
+            </w:pPr>
+            <w:r>
+              <w:rPr>
+                <w:rFonts w:ascii="Times New Roman" w:hAnsi="Times New Roman"/>
+                <w:sz w:val="20"/>
+              </w:rPr>
+              <w:t>organization_id (FK, nullable)</w:t>
             </w:r>
           </w:p>
         </w:tc>
@@ -2209,15 +2165,14 @@
           </w:tcPr>
           <w:p>
             <w:pPr>
-              <w:jc w:val="both"/>
-            </w:pPr>
-            <w:proofErr w:type="gramStart"/>
-            <w:r>
-              <w:t>VARCHAR(</w:t>
-            </w:r>
-            <w:proofErr w:type="gramEnd"/>
-            <w:r>
-              <w:t>150)</w:t>
+              <w:spacing w:after="60"/>
+            </w:pPr>
+            <w:r>
+              <w:rPr>
+                <w:rFonts w:ascii="Times New Roman" w:hAnsi="Times New Roman"/>
+                <w:sz w:val="20"/>
+              </w:rPr>
+              <w:t>Id</w:t>
             </w:r>
           </w:p>
         </w:tc>
@@ -2239,26 +2194,14 @@
           </w:tcPr>
           <w:p>
             <w:pPr>
-              <w:jc w:val="both"/>
-            </w:pPr>
-            <w:r>
-              <w:t xml:space="preserve">Nama </w:t>
-            </w:r>
-            <w:proofErr w:type="spellStart"/>
-            <w:r>
-              <w:t>lengkap</w:t>
-            </w:r>
-            <w:proofErr w:type="spellEnd"/>
-            <w:r>
-              <w:t xml:space="preserve"> </w:t>
-            </w:r>
-            <w:proofErr w:type="spellStart"/>
-            <w:r>
-              <w:t>pengguna</w:t>
-            </w:r>
-            <w:proofErr w:type="spellEnd"/>
-            <w:r>
-              <w:t>.</w:t>
+              <w:spacing w:after="60"/>
+            </w:pPr>
+            <w:r>
+              <w:rPr>
+                <w:rFonts w:ascii="Times New Roman" w:hAnsi="Times New Roman"/>
+                <w:sz w:val="20"/>
+              </w:rPr>
+              <w:t>Mengacu Organization; wajib bagi penyelenggara, boleh kosong untuk mahasiswa/admin.</w:t>
             </w:r>
           </w:p>
         </w:tc>
@@ -2270,6 +2213,9 @@
             <w:bottom w:w="0" w:type="dxa"/>
           </w:tblCellMar>
         </w:tblPrEx>
+        <w:trPr>
+          <w:cantSplit/>
+        </w:trPr>
         <w:tc>
           <w:tcPr>
             <w:tcW w:w="2200" w:type="dxa"/>
@@ -2288,10 +2234,14 @@
           </w:tcPr>
           <w:p>
             <w:pPr>
-              <w:jc w:val="both"/>
-            </w:pPr>
-            <w:r>
-              <w:t>email (unique)</w:t>
+              <w:spacing w:after="60"/>
+            </w:pPr>
+            <w:r>
+              <w:rPr>
+                <w:rFonts w:ascii="Times New Roman" w:hAnsi="Times New Roman"/>
+                <w:sz w:val="20"/>
+              </w:rPr>
+              <w:t>name</w:t>
             </w:r>
           </w:p>
         </w:tc>
@@ -2313,15 +2263,14 @@
           </w:tcPr>
           <w:p>
             <w:pPr>
-              <w:jc w:val="both"/>
-            </w:pPr>
-            <w:proofErr w:type="gramStart"/>
-            <w:r>
-              <w:t>VARCHAR(</w:t>
-            </w:r>
-            <w:proofErr w:type="gramEnd"/>
-            <w:r>
-              <w:t>150)</w:t>
+              <w:spacing w:after="60"/>
+            </w:pPr>
+            <w:r>
+              <w:rPr>
+                <w:rFonts w:ascii="Times New Roman" w:hAnsi="Times New Roman"/>
+                <w:sz w:val="20"/>
+              </w:rPr>
+              <w:t>VARCHAR(150)</w:t>
             </w:r>
           </w:p>
         </w:tc>
@@ -2343,39 +2292,14 @@
           </w:tcPr>
           <w:p>
             <w:pPr>
-              <w:jc w:val="both"/>
-            </w:pPr>
-            <w:proofErr w:type="spellStart"/>
-            <w:r>
-              <w:t>Digunakan</w:t>
-            </w:r>
-            <w:proofErr w:type="spellEnd"/>
-            <w:r>
-              <w:t xml:space="preserve"> </w:t>
-            </w:r>
-            <w:proofErr w:type="spellStart"/>
-            <w:r>
-              <w:t>untuk</w:t>
-            </w:r>
-            <w:proofErr w:type="spellEnd"/>
-            <w:r>
-              <w:t xml:space="preserve"> login; </w:t>
-            </w:r>
-            <w:proofErr w:type="spellStart"/>
-            <w:r>
-              <w:t>harus</w:t>
-            </w:r>
-            <w:proofErr w:type="spellEnd"/>
-            <w:r>
-              <w:t xml:space="preserve"> </w:t>
-            </w:r>
-            <w:proofErr w:type="spellStart"/>
-            <w:r>
-              <w:t>unik</w:t>
-            </w:r>
-            <w:proofErr w:type="spellEnd"/>
-            <w:r>
-              <w:t xml:space="preserve"> (US-AUTH-01, US-AUTH-03).</w:t>
+              <w:spacing w:after="60"/>
+            </w:pPr>
+            <w:r>
+              <w:rPr>
+                <w:rFonts w:ascii="Times New Roman" w:hAnsi="Times New Roman"/>
+                <w:sz w:val="20"/>
+              </w:rPr>
+              <w:t>Nama pengguna.</w:t>
             </w:r>
           </w:p>
         </w:tc>
@@ -2387,6 +2311,9 @@
             <w:bottom w:w="0" w:type="dxa"/>
           </w:tblCellMar>
         </w:tblPrEx>
+        <w:trPr>
+          <w:cantSplit/>
+        </w:trPr>
         <w:tc>
           <w:tcPr>
             <w:tcW w:w="2200" w:type="dxa"/>
@@ -2405,13 +2332,15 @@
           </w:tcPr>
           <w:p>
             <w:pPr>
-              <w:jc w:val="both"/>
-            </w:pPr>
-            <w:proofErr w:type="spellStart"/>
-            <w:r>
-              <w:t>password_hash</w:t>
-            </w:r>
-            <w:proofErr w:type="spellEnd"/>
+              <w:spacing w:after="60"/>
+            </w:pPr>
+            <w:r>
+              <w:rPr>
+                <w:rFonts w:ascii="Times New Roman" w:hAnsi="Times New Roman"/>
+                <w:sz w:val="20"/>
+              </w:rPr>
+              <w:t>email (unique)</w:t>
+            </w:r>
           </w:p>
         </w:tc>
         <w:tc>
@@ -2432,15 +2361,14 @@
           </w:tcPr>
           <w:p>
             <w:pPr>
-              <w:jc w:val="both"/>
-            </w:pPr>
-            <w:proofErr w:type="gramStart"/>
-            <w:r>
-              <w:t>VARCHAR(</w:t>
-            </w:r>
-            <w:proofErr w:type="gramEnd"/>
-            <w:r>
-              <w:t>255)</w:t>
+              <w:spacing w:after="60"/>
+            </w:pPr>
+            <w:r>
+              <w:rPr>
+                <w:rFonts w:ascii="Times New Roman" w:hAnsi="Times New Roman"/>
+                <w:sz w:val="20"/>
+              </w:rPr>
+              <w:t>VARCHAR(150)</w:t>
             </w:r>
           </w:p>
         </w:tc>
@@ -2462,50 +2390,14 @@
           </w:tcPr>
           <w:p>
             <w:pPr>
-              <w:jc w:val="both"/>
-            </w:pPr>
-            <w:r>
-              <w:t xml:space="preserve">Kata </w:t>
-            </w:r>
-            <w:proofErr w:type="spellStart"/>
-            <w:r>
-              <w:t>sandi</w:t>
-            </w:r>
-            <w:proofErr w:type="spellEnd"/>
-            <w:r>
-              <w:t xml:space="preserve"> yang </w:t>
-            </w:r>
-            <w:proofErr w:type="spellStart"/>
-            <w:r>
-              <w:t>sudah</w:t>
-            </w:r>
-            <w:proofErr w:type="spellEnd"/>
-            <w:r>
-              <w:t xml:space="preserve"> di-hash, </w:t>
-            </w:r>
-            <w:proofErr w:type="spellStart"/>
-            <w:r>
-              <w:t>tidak</w:t>
-            </w:r>
-            <w:proofErr w:type="spellEnd"/>
-            <w:r>
-              <w:t xml:space="preserve"> </w:t>
-            </w:r>
-            <w:proofErr w:type="spellStart"/>
-            <w:r>
-              <w:t>pernah</w:t>
-            </w:r>
-            <w:proofErr w:type="spellEnd"/>
-            <w:r>
-              <w:t xml:space="preserve"> </w:t>
-            </w:r>
-            <w:proofErr w:type="spellStart"/>
-            <w:r>
-              <w:t>disimpan</w:t>
-            </w:r>
-            <w:proofErr w:type="spellEnd"/>
-            <w:r>
-              <w:t xml:space="preserve"> plain text.</w:t>
+              <w:spacing w:after="60"/>
+            </w:pPr>
+            <w:r>
+              <w:rPr>
+                <w:rFonts w:ascii="Times New Roman" w:hAnsi="Times New Roman"/>
+                <w:sz w:val="20"/>
+              </w:rPr>
+              <w:t>Email login unik.</w:t>
             </w:r>
           </w:p>
         </w:tc>
@@ -2517,6 +2409,9 @@
             <w:bottom w:w="0" w:type="dxa"/>
           </w:tblCellMar>
         </w:tblPrEx>
+        <w:trPr>
+          <w:cantSplit/>
+        </w:trPr>
         <w:tc>
           <w:tcPr>
             <w:tcW w:w="2200" w:type="dxa"/>
@@ -2535,10 +2430,14 @@
           </w:tcPr>
           <w:p>
             <w:pPr>
-              <w:jc w:val="both"/>
-            </w:pPr>
-            <w:r>
-              <w:t>role</w:t>
+              <w:spacing w:after="60"/>
+            </w:pPr>
+            <w:r>
+              <w:rPr>
+                <w:rFonts w:ascii="Times New Roman" w:hAnsi="Times New Roman"/>
+                <w:sz w:val="20"/>
+              </w:rPr>
+              <w:t>password_hash</w:t>
             </w:r>
           </w:p>
         </w:tc>
@@ -2560,10 +2459,14 @@
           </w:tcPr>
           <w:p>
             <w:pPr>
-              <w:jc w:val="both"/>
-            </w:pPr>
-            <w:r>
-              <w:t>ENUM</w:t>
+              <w:spacing w:after="60"/>
+            </w:pPr>
+            <w:r>
+              <w:rPr>
+                <w:rFonts w:ascii="Times New Roman" w:hAnsi="Times New Roman"/>
+                <w:sz w:val="20"/>
+              </w:rPr>
+              <w:t>VARCHAR(255)</w:t>
             </w:r>
           </w:p>
         </w:tc>
@@ -2585,47 +2488,14 @@
           </w:tcPr>
           <w:p>
             <w:pPr>
-              <w:jc w:val="both"/>
-            </w:pPr>
-            <w:proofErr w:type="spellStart"/>
-            <w:r>
-              <w:t>mahasiswa</w:t>
-            </w:r>
-            <w:proofErr w:type="spellEnd"/>
-            <w:r>
-              <w:t xml:space="preserve"> | </w:t>
-            </w:r>
-            <w:proofErr w:type="spellStart"/>
-            <w:r>
-              <w:t>penyelenggara</w:t>
-            </w:r>
-            <w:proofErr w:type="spellEnd"/>
-            <w:r>
-              <w:t xml:space="preserve"> | admin — </w:t>
-            </w:r>
-            <w:proofErr w:type="spellStart"/>
-            <w:r>
-              <w:t>menentukan</w:t>
-            </w:r>
-            <w:proofErr w:type="spellEnd"/>
-            <w:r>
-              <w:t xml:space="preserve"> </w:t>
-            </w:r>
-            <w:proofErr w:type="spellStart"/>
-            <w:r>
-              <w:t>hak</w:t>
-            </w:r>
-            <w:proofErr w:type="spellEnd"/>
-            <w:r>
-              <w:t xml:space="preserve"> </w:t>
-            </w:r>
-            <w:proofErr w:type="spellStart"/>
-            <w:r>
-              <w:t>akses</w:t>
-            </w:r>
-            <w:proofErr w:type="spellEnd"/>
-            <w:r>
-              <w:t xml:space="preserve"> (US-AUTH-02, US-AUTH-04, US-AUTH-05).</w:t>
+              <w:spacing w:after="60"/>
+            </w:pPr>
+            <w:r>
+              <w:rPr>
+                <w:rFonts w:ascii="Times New Roman" w:hAnsi="Times New Roman"/>
+                <w:sz w:val="20"/>
+              </w:rPr>
+              <w:t>Hash kata sandi; kata sandi registrasi minimal 8 karakter.</w:t>
             </w:r>
           </w:p>
         </w:tc>
@@ -2637,6 +2507,9 @@
             <w:bottom w:w="0" w:type="dxa"/>
           </w:tblCellMar>
         </w:tblPrEx>
+        <w:trPr>
+          <w:cantSplit/>
+        </w:trPr>
         <w:tc>
           <w:tcPr>
             <w:tcW w:w="2200" w:type="dxa"/>
@@ -2655,13 +2528,15 @@
           </w:tcPr>
           <w:p>
             <w:pPr>
-              <w:jc w:val="both"/>
-            </w:pPr>
-            <w:proofErr w:type="spellStart"/>
-            <w:r>
-              <w:t>created_at</w:t>
-            </w:r>
-            <w:proofErr w:type="spellEnd"/>
+              <w:spacing w:after="60"/>
+            </w:pPr>
+            <w:r>
+              <w:rPr>
+                <w:rFonts w:ascii="Times New Roman" w:hAnsi="Times New Roman"/>
+                <w:sz w:val="20"/>
+              </w:rPr>
+              <w:t>role</w:t>
+            </w:r>
           </w:p>
         </w:tc>
         <w:tc>
@@ -2682,10 +2557,14 @@
           </w:tcPr>
           <w:p>
             <w:pPr>
-              <w:jc w:val="both"/>
-            </w:pPr>
-            <w:r>
-              <w:t>TIMESTAMP</w:t>
+              <w:spacing w:after="60"/>
+            </w:pPr>
+            <w:r>
+              <w:rPr>
+                <w:rFonts w:ascii="Times New Roman" w:hAnsi="Times New Roman"/>
+                <w:sz w:val="20"/>
+              </w:rPr>
+              <w:t>ENUM</w:t>
             </w:r>
           </w:p>
         </w:tc>
@@ -2707,26 +2586,14 @@
           </w:tcPr>
           <w:p>
             <w:pPr>
-              <w:jc w:val="both"/>
-            </w:pPr>
-            <w:r>
-              <w:t xml:space="preserve">Waktu </w:t>
-            </w:r>
-            <w:proofErr w:type="spellStart"/>
-            <w:r>
-              <w:t>akun</w:t>
-            </w:r>
-            <w:proofErr w:type="spellEnd"/>
-            <w:r>
-              <w:t xml:space="preserve"> </w:t>
-            </w:r>
-            <w:proofErr w:type="spellStart"/>
-            <w:r>
-              <w:t>dibuat</w:t>
-            </w:r>
-            <w:proofErr w:type="spellEnd"/>
-            <w:r>
-              <w:t>.</w:t>
+              <w:spacing w:after="60"/>
+            </w:pPr>
+            <w:r>
+              <w:rPr>
+                <w:rFonts w:ascii="Times New Roman" w:hAnsi="Times New Roman"/>
+                <w:sz w:val="20"/>
+              </w:rPr>
+              <w:t>mahasiswa | penyelenggara | admin. Admin dibuat internal.</w:t>
             </w:r>
           </w:p>
         </w:tc>
@@ -2738,6 +2605,9 @@
             <w:bottom w:w="0" w:type="dxa"/>
           </w:tblCellMar>
         </w:tblPrEx>
+        <w:trPr>
+          <w:cantSplit/>
+        </w:trPr>
         <w:tc>
           <w:tcPr>
             <w:tcW w:w="2200" w:type="dxa"/>
@@ -2756,13 +2626,15 @@
           </w:tcPr>
           <w:p>
             <w:pPr>
-              <w:jc w:val="both"/>
-            </w:pPr>
-            <w:proofErr w:type="spellStart"/>
-            <w:r>
-              <w:t>updated_at</w:t>
-            </w:r>
-            <w:proofErr w:type="spellEnd"/>
+              <w:spacing w:after="60"/>
+            </w:pPr>
+            <w:r>
+              <w:rPr>
+                <w:rFonts w:ascii="Times New Roman" w:hAnsi="Times New Roman"/>
+                <w:sz w:val="20"/>
+              </w:rPr>
+              <w:t>status</w:t>
+            </w:r>
           </w:p>
         </w:tc>
         <w:tc>
@@ -2783,9 +2655,111 @@
           </w:tcPr>
           <w:p>
             <w:pPr>
-              <w:jc w:val="both"/>
-            </w:pPr>
-            <w:r>
+              <w:spacing w:after="60"/>
+            </w:pPr>
+            <w:r>
+              <w:rPr>
+                <w:rFonts w:ascii="Times New Roman" w:hAnsi="Times New Roman"/>
+                <w:sz w:val="20"/>
+              </w:rPr>
+              <w:t>ENUM</w:t>
+            </w:r>
+          </w:p>
+        </w:tc>
+        <w:tc>
+          <w:tcPr>
+            <w:tcW w:w="5200" w:type="dxa"/>
+            <w:tcBorders>
+              <w:top w:val="single" w:sz="4" w:space="0" w:color="999999"/>
+              <w:left w:val="single" w:sz="4" w:space="0" w:color="999999"/>
+              <w:bottom w:val="single" w:sz="4" w:space="0" w:color="999999"/>
+              <w:right w:val="single" w:sz="4" w:space="0" w:color="999999"/>
+            </w:tcBorders>
+            <w:tcMar>
+              <w:top w:w="80" w:type="dxa"/>
+              <w:left w:w="100" w:type="dxa"/>
+              <w:bottom w:w="80" w:type="dxa"/>
+              <w:right w:w="100" w:type="dxa"/>
+            </w:tcMar>
+          </w:tcPr>
+          <w:p>
+            <w:pPr>
+              <w:spacing w:after="60"/>
+            </w:pPr>
+            <w:r>
+              <w:rPr>
+                <w:rFonts w:ascii="Times New Roman" w:hAnsi="Times New Roman"/>
+                <w:sz w:val="20"/>
+              </w:rPr>
+              <w:t>pending | active | inactive; penyelenggara menunggu verifikasi organisasi.</w:t>
+            </w:r>
+          </w:p>
+        </w:tc>
+      </w:tr>
+      <w:tr>
+        <w:tblPrEx>
+          <w:tblCellMar>
+            <w:top w:w="0" w:type="dxa"/>
+            <w:bottom w:w="0" w:type="dxa"/>
+          </w:tblCellMar>
+        </w:tblPrEx>
+        <w:trPr>
+          <w:cantSplit/>
+        </w:trPr>
+        <w:tc>
+          <w:tcPr>
+            <w:tcW w:w="2200" w:type="dxa"/>
+            <w:tcBorders>
+              <w:top w:val="single" w:sz="4" w:space="0" w:color="999999"/>
+              <w:left w:val="single" w:sz="4" w:space="0" w:color="999999"/>
+              <w:bottom w:val="single" w:sz="4" w:space="0" w:color="999999"/>
+              <w:right w:val="single" w:sz="4" w:space="0" w:color="999999"/>
+            </w:tcBorders>
+            <w:tcMar>
+              <w:top w:w="80" w:type="dxa"/>
+              <w:left w:w="100" w:type="dxa"/>
+              <w:bottom w:w="80" w:type="dxa"/>
+              <w:right w:w="100" w:type="dxa"/>
+            </w:tcMar>
+          </w:tcPr>
+          <w:p>
+            <w:pPr>
+              <w:spacing w:after="60"/>
+            </w:pPr>
+            <w:r>
+              <w:rPr>
+                <w:rFonts w:ascii="Times New Roman" w:hAnsi="Times New Roman"/>
+                <w:sz w:val="20"/>
+              </w:rPr>
+              <w:t>created_at, updated_at</w:t>
+            </w:r>
+          </w:p>
+        </w:tc>
+        <w:tc>
+          <w:tcPr>
+            <w:tcW w:w="2200" w:type="dxa"/>
+            <w:tcBorders>
+              <w:top w:val="single" w:sz="4" w:space="0" w:color="999999"/>
+              <w:left w:val="single" w:sz="4" w:space="0" w:color="999999"/>
+              <w:bottom w:val="single" w:sz="4" w:space="0" w:color="999999"/>
+              <w:right w:val="single" w:sz="4" w:space="0" w:color="999999"/>
+            </w:tcBorders>
+            <w:tcMar>
+              <w:top w:w="80" w:type="dxa"/>
+              <w:left w:w="100" w:type="dxa"/>
+              <w:bottom w:w="80" w:type="dxa"/>
+              <w:right w:w="100" w:type="dxa"/>
+            </w:tcMar>
+          </w:tcPr>
+          <w:p>
+            <w:pPr>
+              <w:spacing w:after="60"/>
+            </w:pPr>
+            <w:r>
+              <w:rPr>
+                <w:rFonts w:ascii="Times New Roman" w:hAnsi="Times New Roman"/>
+                <w:sz w:val="20"/>
+              </w:rPr>
               <w:t>TIMESTAMP</w:t>
             </w:r>
           </w:p>
@@ -2808,34 +2782,14 @@
           </w:tcPr>
           <w:p>
             <w:pPr>
-              <w:jc w:val="both"/>
-            </w:pPr>
-            <w:r>
-              <w:t xml:space="preserve">Waktu </w:t>
-            </w:r>
-            <w:proofErr w:type="spellStart"/>
-            <w:r>
-              <w:t>terakhir</w:t>
-            </w:r>
-            <w:proofErr w:type="spellEnd"/>
-            <w:r>
-              <w:t xml:space="preserve"> data </w:t>
-            </w:r>
-            <w:proofErr w:type="spellStart"/>
-            <w:r>
-              <w:t>akun</w:t>
-            </w:r>
-            <w:proofErr w:type="spellEnd"/>
-            <w:r>
-              <w:t xml:space="preserve"> </w:t>
-            </w:r>
-            <w:proofErr w:type="spellStart"/>
-            <w:r>
-              <w:t>diperbarui</w:t>
-            </w:r>
-            <w:proofErr w:type="spellEnd"/>
-            <w:r>
-              <w:t>.</w:t>
+              <w:spacing w:after="60"/>
+            </w:pPr>
+            <w:r>
+              <w:rPr>
+                <w:rFonts w:ascii="Times New Roman" w:hAnsi="Times New Roman"/>
+                <w:sz w:val="20"/>
+              </w:rPr>
+              <w:t>Waktu pembuatan dan perubahan akun.</w:t>
             </w:r>
           </w:p>
         </w:tc>
@@ -2928,6 +2882,8 @@
         </w:tblPrEx>
         <w:trPr>
           <w:tblHeader/>
+          <w:cantSplit/>
+          <w:tblHeader/>
         </w:trPr>
         <w:tc>
           <w:tcPr>
@@ -3047,6 +3003,9 @@
             <w:bottom w:w="0" w:type="dxa"/>
           </w:tblCellMar>
         </w:tblPrEx>
+        <w:trPr>
+          <w:cantSplit/>
+        </w:trPr>
         <w:tc>
           <w:tcPr>
             <w:tcW w:w="2200" w:type="dxa"/>
@@ -3065,16 +3024,14 @@
           </w:tcPr>
           <w:p>
             <w:pPr>
-              <w:keepNext/>
-              <w:jc w:val="both"/>
-            </w:pPr>
-            <w:proofErr w:type="spellStart"/>
-            <w:r>
-              <w:t>category_id</w:t>
-            </w:r>
-            <w:proofErr w:type="spellEnd"/>
-            <w:r>
-              <w:t xml:space="preserve"> (PK)</w:t>
+              <w:spacing w:after="60"/>
+            </w:pPr>
+            <w:r>
+              <w:rPr>
+                <w:rFonts w:ascii="Times New Roman" w:hAnsi="Times New Roman"/>
+                <w:sz w:val="20"/>
+              </w:rPr>
+              <w:t>category_id (PK)</w:t>
             </w:r>
           </w:p>
         </w:tc>
@@ -3096,11 +3053,14 @@
           </w:tcPr>
           <w:p>
             <w:pPr>
-              <w:keepNext/>
-              <w:jc w:val="both"/>
-            </w:pPr>
-            <w:r>
-              <w:t>INT / UUID</w:t>
+              <w:spacing w:after="60"/>
+            </w:pPr>
+            <w:r>
+              <w:rPr>
+                <w:rFonts w:ascii="Times New Roman" w:hAnsi="Times New Roman"/>
+                <w:sz w:val="20"/>
+              </w:rPr>
+              <w:t>Id</w:t>
             </w:r>
           </w:p>
         </w:tc>
@@ -3122,19 +3082,14 @@
           </w:tcPr>
           <w:p>
             <w:pPr>
-              <w:keepNext/>
-              <w:jc w:val="both"/>
-            </w:pPr>
-            <w:r>
-              <w:t xml:space="preserve">Primary key </w:t>
-            </w:r>
-            <w:proofErr w:type="spellStart"/>
-            <w:r>
-              <w:t>kategori</w:t>
-            </w:r>
-            <w:proofErr w:type="spellEnd"/>
-            <w:r>
-              <w:t xml:space="preserve"> event.</w:t>
+              <w:spacing w:after="60"/>
+            </w:pPr>
+            <w:r>
+              <w:rPr>
+                <w:rFonts w:ascii="Times New Roman" w:hAnsi="Times New Roman"/>
+                <w:sz w:val="20"/>
+              </w:rPr>
+              <w:t>Primary key kategori.</w:t>
             </w:r>
           </w:p>
         </w:tc>
@@ -3146,6 +3101,9 @@
             <w:bottom w:w="0" w:type="dxa"/>
           </w:tblCellMar>
         </w:tblPrEx>
+        <w:trPr>
+          <w:cantSplit/>
+        </w:trPr>
         <w:tc>
           <w:tcPr>
             <w:tcW w:w="2200" w:type="dxa"/>
@@ -3164,17 +3122,14 @@
           </w:tcPr>
           <w:p>
             <w:pPr>
-              <w:keepNext/>
-              <w:jc w:val="both"/>
-            </w:pPr>
-            <w:proofErr w:type="spellStart"/>
-            <w:r>
-              <w:lastRenderedPageBreak/>
-              <w:t>category_name</w:t>
-            </w:r>
-            <w:proofErr w:type="spellEnd"/>
-            <w:r>
-              <w:t xml:space="preserve"> (unique)</w:t>
+              <w:spacing w:after="60"/>
+            </w:pPr>
+            <w:r>
+              <w:rPr>
+                <w:rFonts w:ascii="Times New Roman" w:hAnsi="Times New Roman"/>
+                <w:sz w:val="20"/>
+              </w:rPr>
+              <w:t>category_name (unique)</w:t>
             </w:r>
           </w:p>
         </w:tc>
@@ -3196,16 +3151,14 @@
           </w:tcPr>
           <w:p>
             <w:pPr>
-              <w:keepNext/>
-              <w:jc w:val="both"/>
-            </w:pPr>
-            <w:proofErr w:type="gramStart"/>
-            <w:r>
-              <w:t>VARCHAR(</w:t>
-            </w:r>
-            <w:proofErr w:type="gramEnd"/>
-            <w:r>
-              <w:t>100)</w:t>
+              <w:spacing w:after="60"/>
+            </w:pPr>
+            <w:r>
+              <w:rPr>
+                <w:rFonts w:ascii="Times New Roman" w:hAnsi="Times New Roman"/>
+                <w:sz w:val="20"/>
+              </w:rPr>
+              <w:t>VARCHAR(100)</w:t>
             </w:r>
           </w:p>
         </w:tc>
@@ -3227,27 +3180,112 @@
           </w:tcPr>
           <w:p>
             <w:pPr>
-              <w:keepNext/>
-              <w:jc w:val="both"/>
-            </w:pPr>
-            <w:r>
-              <w:t xml:space="preserve">Nama </w:t>
-            </w:r>
-            <w:proofErr w:type="spellStart"/>
-            <w:r>
-              <w:t>kategori</w:t>
-            </w:r>
-            <w:proofErr w:type="spellEnd"/>
-            <w:r>
-              <w:t xml:space="preserve"> (mis. Seminar, Lomba, Workshop); </w:t>
-            </w:r>
-            <w:proofErr w:type="spellStart"/>
-            <w:r>
-              <w:t>mendukung</w:t>
-            </w:r>
-            <w:proofErr w:type="spellEnd"/>
-            <w:r>
-              <w:t xml:space="preserve"> filter pada US-EVENT-05.</w:t>
+              <w:spacing w:after="60"/>
+            </w:pPr>
+            <w:r>
+              <w:rPr>
+                <w:rFonts w:ascii="Times New Roman" w:hAnsi="Times New Roman"/>
+                <w:sz w:val="20"/>
+              </w:rPr>
+              <w:t>Nama kategori untuk pencarian dan pengaturan minat.</w:t>
+            </w:r>
+          </w:p>
+        </w:tc>
+      </w:tr>
+      <w:tr>
+        <w:tblPrEx>
+          <w:tblCellMar>
+            <w:top w:w="0" w:type="dxa"/>
+            <w:bottom w:w="0" w:type="dxa"/>
+          </w:tblCellMar>
+        </w:tblPrEx>
+        <w:trPr>
+          <w:cantSplit/>
+        </w:trPr>
+        <w:tc>
+          <w:tcPr>
+            <w:tcW w:w="2200" w:type="dxa"/>
+            <w:tcBorders>
+              <w:top w:val="single" w:sz="4" w:space="0" w:color="999999"/>
+              <w:left w:val="single" w:sz="4" w:space="0" w:color="999999"/>
+              <w:bottom w:val="single" w:sz="4" w:space="0" w:color="999999"/>
+              <w:right w:val="single" w:sz="4" w:space="0" w:color="999999"/>
+            </w:tcBorders>
+            <w:tcMar>
+              <w:top w:w="80" w:type="dxa"/>
+              <w:left w:w="100" w:type="dxa"/>
+              <w:bottom w:w="80" w:type="dxa"/>
+              <w:right w:w="100" w:type="dxa"/>
+            </w:tcMar>
+          </w:tcPr>
+          <w:p>
+            <w:pPr>
+              <w:spacing w:after="60"/>
+            </w:pPr>
+            <w:r>
+              <w:rPr>
+                <w:rFonts w:ascii="Times New Roman" w:hAnsi="Times New Roman"/>
+                <w:sz w:val="20"/>
+              </w:rPr>
+              <w:t>is_active</w:t>
+            </w:r>
+          </w:p>
+        </w:tc>
+        <w:tc>
+          <w:tcPr>
+            <w:tcW w:w="2200" w:type="dxa"/>
+            <w:tcBorders>
+              <w:top w:val="single" w:sz="4" w:space="0" w:color="999999"/>
+              <w:left w:val="single" w:sz="4" w:space="0" w:color="999999"/>
+              <w:bottom w:val="single" w:sz="4" w:space="0" w:color="999999"/>
+              <w:right w:val="single" w:sz="4" w:space="0" w:color="999999"/>
+            </w:tcBorders>
+            <w:tcMar>
+              <w:top w:w="80" w:type="dxa"/>
+              <w:left w:w="100" w:type="dxa"/>
+              <w:bottom w:w="80" w:type="dxa"/>
+              <w:right w:w="100" w:type="dxa"/>
+            </w:tcMar>
+          </w:tcPr>
+          <w:p>
+            <w:pPr>
+              <w:spacing w:after="60"/>
+            </w:pPr>
+            <w:r>
+              <w:rPr>
+                <w:rFonts w:ascii="Times New Roman" w:hAnsi="Times New Roman"/>
+                <w:sz w:val="20"/>
+              </w:rPr>
+              <w:t>BOOLEAN</w:t>
+            </w:r>
+          </w:p>
+        </w:tc>
+        <w:tc>
+          <w:tcPr>
+            <w:tcW w:w="5200" w:type="dxa"/>
+            <w:tcBorders>
+              <w:top w:val="single" w:sz="4" w:space="0" w:color="999999"/>
+              <w:left w:val="single" w:sz="4" w:space="0" w:color="999999"/>
+              <w:bottom w:val="single" w:sz="4" w:space="0" w:color="999999"/>
+              <w:right w:val="single" w:sz="4" w:space="0" w:color="999999"/>
+            </w:tcBorders>
+            <w:tcMar>
+              <w:top w:w="80" w:type="dxa"/>
+              <w:left w:w="100" w:type="dxa"/>
+              <w:bottom w:w="80" w:type="dxa"/>
+              <w:right w:w="100" w:type="dxa"/>
+            </w:tcMar>
+          </w:tcPr>
+          <w:p>
+            <w:pPr>
+              <w:spacing w:after="60"/>
+            </w:pPr>
+            <w:r>
+              <w:rPr>
+                <w:rFonts w:ascii="Times New Roman" w:hAnsi="Times New Roman"/>
+                <w:sz w:val="20"/>
+              </w:rPr>
+              <w:t>Admin dapat menonaktifkan kategori (FR-ADM-01).</w:t>
             </w:r>
           </w:p>
         </w:tc>
@@ -3319,6 +3357,8 @@
         </w:tblPrEx>
         <w:trPr>
           <w:tblHeader/>
+          <w:cantSplit/>
+          <w:tblHeader/>
         </w:trPr>
         <w:tc>
           <w:tcPr>
@@ -3435,6 +3475,9 @@
             <w:bottom w:w="0" w:type="dxa"/>
           </w:tblCellMar>
         </w:tblPrEx>
+        <w:trPr>
+          <w:cantSplit/>
+        </w:trPr>
         <w:tc>
           <w:tcPr>
             <w:tcW w:w="2200" w:type="dxa"/>
@@ -3453,15 +3496,14 @@
           </w:tcPr>
           <w:p>
             <w:pPr>
-              <w:jc w:val="both"/>
-            </w:pPr>
-            <w:proofErr w:type="spellStart"/>
-            <w:r>
-              <w:t>event_id</w:t>
-            </w:r>
-            <w:proofErr w:type="spellEnd"/>
-            <w:r>
-              <w:t xml:space="preserve"> (PK)</w:t>
+              <w:spacing w:after="60"/>
+            </w:pPr>
+            <w:r>
+              <w:rPr>
+                <w:rFonts w:ascii="Times New Roman" w:hAnsi="Times New Roman"/>
+                <w:sz w:val="20"/>
+              </w:rPr>
+              <w:t>event_id (PK)</w:t>
             </w:r>
           </w:p>
         </w:tc>
@@ -3483,10 +3525,14 @@
           </w:tcPr>
           <w:p>
             <w:pPr>
-              <w:jc w:val="both"/>
-            </w:pPr>
-            <w:r>
-              <w:t>UUID / BIGINT</w:t>
+              <w:spacing w:after="60"/>
+            </w:pPr>
+            <w:r>
+              <w:rPr>
+                <w:rFonts w:ascii="Times New Roman" w:hAnsi="Times New Roman"/>
+                <w:sz w:val="20"/>
+              </w:rPr>
+              <w:t>Id</w:t>
             </w:r>
           </w:p>
         </w:tc>
@@ -3508,9 +3554,13 @@
           </w:tcPr>
           <w:p>
             <w:pPr>
-              <w:jc w:val="both"/>
-            </w:pPr>
-            <w:r>
+              <w:spacing w:after="60"/>
+            </w:pPr>
+            <w:r>
+              <w:rPr>
+                <w:rFonts w:ascii="Times New Roman" w:hAnsi="Times New Roman"/>
+                <w:sz w:val="20"/>
+              </w:rPr>
               <w:t>Primary key event.</w:t>
             </w:r>
           </w:p>
@@ -3523,6 +3573,9 @@
             <w:bottom w:w="0" w:type="dxa"/>
           </w:tblCellMar>
         </w:tblPrEx>
+        <w:trPr>
+          <w:cantSplit/>
+        </w:trPr>
         <w:tc>
           <w:tcPr>
             <w:tcW w:w="2200" w:type="dxa"/>
@@ -3541,23 +3594,14 @@
           </w:tcPr>
           <w:p>
             <w:pPr>
-              <w:jc w:val="both"/>
-            </w:pPr>
-            <w:proofErr w:type="spellStart"/>
-            <w:r>
-              <w:t>organizer_id</w:t>
-            </w:r>
-            <w:proofErr w:type="spellEnd"/>
-            <w:r>
-              <w:t xml:space="preserve"> (FK → </w:t>
-            </w:r>
-            <w:proofErr w:type="spellStart"/>
-            <w:r>
-              <w:t>User.user_id</w:t>
-            </w:r>
-            <w:proofErr w:type="spellEnd"/>
-            <w:r>
-              <w:t>)</w:t>
+              <w:spacing w:after="60"/>
+            </w:pPr>
+            <w:r>
+              <w:rPr>
+                <w:rFonts w:ascii="Times New Roman" w:hAnsi="Times New Roman"/>
+                <w:sz w:val="20"/>
+              </w:rPr>
+              <w:t>organization_id (FK)</w:t>
             </w:r>
           </w:p>
         </w:tc>
@@ -3579,10 +3623,14 @@
           </w:tcPr>
           <w:p>
             <w:pPr>
-              <w:jc w:val="both"/>
-            </w:pPr>
-            <w:r>
-              <w:t>UUID / BIGINT</w:t>
+              <w:spacing w:after="60"/>
+            </w:pPr>
+            <w:r>
+              <w:rPr>
+                <w:rFonts w:ascii="Times New Roman" w:hAnsi="Times New Roman"/>
+                <w:sz w:val="20"/>
+              </w:rPr>
+              <w:t>Id</w:t>
             </w:r>
           </w:p>
         </w:tc>
@@ -3604,71 +3652,14 @@
           </w:tcPr>
           <w:p>
             <w:pPr>
-              <w:jc w:val="both"/>
-            </w:pPr>
-            <w:proofErr w:type="spellStart"/>
-            <w:r>
-              <w:t>Pengguna</w:t>
-            </w:r>
-            <w:proofErr w:type="spellEnd"/>
-            <w:r>
-              <w:t xml:space="preserve"> </w:t>
-            </w:r>
-            <w:proofErr w:type="spellStart"/>
-            <w:r>
-              <w:t>berperan</w:t>
-            </w:r>
-            <w:proofErr w:type="spellEnd"/>
-            <w:r>
-              <w:t xml:space="preserve"> </w:t>
-            </w:r>
-            <w:proofErr w:type="spellStart"/>
-            <w:r>
-              <w:t>penyelenggara</w:t>
-            </w:r>
-            <w:proofErr w:type="spellEnd"/>
-            <w:r>
-              <w:t xml:space="preserve"> yang </w:t>
-            </w:r>
-            <w:proofErr w:type="spellStart"/>
-            <w:r>
-              <w:t>mengajukan</w:t>
-            </w:r>
-            <w:proofErr w:type="spellEnd"/>
-            <w:r>
-              <w:t xml:space="preserve"> event (US-EVENT-01); </w:t>
-            </w:r>
-            <w:proofErr w:type="spellStart"/>
-            <w:r>
-              <w:t>dipakai</w:t>
-            </w:r>
-            <w:proofErr w:type="spellEnd"/>
-            <w:r>
-              <w:t xml:space="preserve"> juga </w:t>
-            </w:r>
-            <w:proofErr w:type="spellStart"/>
-            <w:r>
-              <w:t>untuk</w:t>
-            </w:r>
-            <w:proofErr w:type="spellEnd"/>
-            <w:r>
-              <w:t xml:space="preserve"> </w:t>
-            </w:r>
-            <w:proofErr w:type="spellStart"/>
-            <w:r>
-              <w:t>validasi</w:t>
-            </w:r>
-            <w:proofErr w:type="spellEnd"/>
-            <w:r>
-              <w:t xml:space="preserve"> </w:t>
-            </w:r>
-            <w:proofErr w:type="spellStart"/>
-            <w:r>
-              <w:t>kepemilikan</w:t>
-            </w:r>
-            <w:proofErr w:type="spellEnd"/>
-            <w:r>
-              <w:t xml:space="preserve"> pada US-EVENT-04.</w:t>
+              <w:spacing w:after="60"/>
+            </w:pPr>
+            <w:r>
+              <w:rPr>
+                <w:rFonts w:ascii="Times New Roman" w:hAnsi="Times New Roman"/>
+                <w:sz w:val="20"/>
+              </w:rPr>
+              <w:t>Organisasi pemilik event; diambil dari akun penyelenggara.</w:t>
             </w:r>
           </w:p>
         </w:tc>
@@ -3680,6 +3671,9 @@
             <w:bottom w:w="0" w:type="dxa"/>
           </w:tblCellMar>
         </w:tblPrEx>
+        <w:trPr>
+          <w:cantSplit/>
+        </w:trPr>
         <w:tc>
           <w:tcPr>
             <w:tcW w:w="2200" w:type="dxa"/>
@@ -3698,23 +3692,14 @@
           </w:tcPr>
           <w:p>
             <w:pPr>
-              <w:jc w:val="both"/>
-            </w:pPr>
-            <w:proofErr w:type="spellStart"/>
-            <w:r>
-              <w:t>category_id</w:t>
-            </w:r>
-            <w:proofErr w:type="spellEnd"/>
-            <w:r>
-              <w:t xml:space="preserve"> (FK → </w:t>
-            </w:r>
-            <w:proofErr w:type="spellStart"/>
-            <w:r>
-              <w:t>EventCategory.category_id</w:t>
-            </w:r>
-            <w:proofErr w:type="spellEnd"/>
-            <w:r>
-              <w:t>)</w:t>
+              <w:spacing w:after="60"/>
+            </w:pPr>
+            <w:r>
+              <w:rPr>
+                <w:rFonts w:ascii="Times New Roman" w:hAnsi="Times New Roman"/>
+                <w:sz w:val="20"/>
+              </w:rPr>
+              <w:t>organizer_id (FK)</w:t>
             </w:r>
           </w:p>
         </w:tc>
@@ -3736,10 +3721,14 @@
           </w:tcPr>
           <w:p>
             <w:pPr>
-              <w:jc w:val="both"/>
-            </w:pPr>
-            <w:r>
-              <w:t>INT / UUID</w:t>
+              <w:spacing w:after="60"/>
+            </w:pPr>
+            <w:r>
+              <w:rPr>
+                <w:rFonts w:ascii="Times New Roman" w:hAnsi="Times New Roman"/>
+                <w:sz w:val="20"/>
+              </w:rPr>
+              <w:t>Id</w:t>
             </w:r>
           </w:p>
         </w:tc>
@@ -3761,39 +3750,14 @@
           </w:tcPr>
           <w:p>
             <w:pPr>
-              <w:jc w:val="both"/>
-            </w:pPr>
-            <w:proofErr w:type="spellStart"/>
-            <w:r>
-              <w:t>Kategori</w:t>
-            </w:r>
-            <w:proofErr w:type="spellEnd"/>
-            <w:r>
-              <w:t xml:space="preserve"> event </w:t>
-            </w:r>
-            <w:proofErr w:type="spellStart"/>
-            <w:r>
-              <w:t>untuk</w:t>
-            </w:r>
-            <w:proofErr w:type="spellEnd"/>
-            <w:r>
-              <w:t xml:space="preserve"> </w:t>
-            </w:r>
-            <w:proofErr w:type="spellStart"/>
-            <w:r>
-              <w:t>kebutuhan</w:t>
-            </w:r>
-            <w:proofErr w:type="spellEnd"/>
-            <w:r>
-              <w:t xml:space="preserve"> </w:t>
-            </w:r>
-            <w:proofErr w:type="spellStart"/>
-            <w:r>
-              <w:t>pencarian</w:t>
-            </w:r>
-            <w:proofErr w:type="spellEnd"/>
-            <w:r>
-              <w:t>/filter (US-EVENT-05).</w:t>
+              <w:spacing w:after="60"/>
+            </w:pPr>
+            <w:r>
+              <w:rPr>
+                <w:rFonts w:ascii="Times New Roman" w:hAnsi="Times New Roman"/>
+                <w:sz w:val="20"/>
+              </w:rPr>
+              <w:t>User pembuat, berperan penyelenggara dari organisasi tersebut.</w:t>
             </w:r>
           </w:p>
         </w:tc>
@@ -3805,6 +3769,9 @@
             <w:bottom w:w="0" w:type="dxa"/>
           </w:tblCellMar>
         </w:tblPrEx>
+        <w:trPr>
+          <w:cantSplit/>
+        </w:trPr>
         <w:tc>
           <w:tcPr>
             <w:tcW w:w="2200" w:type="dxa"/>
@@ -3823,23 +3790,14 @@
           </w:tcPr>
           <w:p>
             <w:pPr>
-              <w:jc w:val="both"/>
-            </w:pPr>
-            <w:proofErr w:type="spellStart"/>
-            <w:r>
-              <w:t>moderated_by</w:t>
-            </w:r>
-            <w:proofErr w:type="spellEnd"/>
-            <w:r>
-              <w:t xml:space="preserve"> (FK → </w:t>
-            </w:r>
-            <w:proofErr w:type="spellStart"/>
-            <w:r>
-              <w:t>User.user_id</w:t>
-            </w:r>
-            <w:proofErr w:type="spellEnd"/>
-            <w:r>
-              <w:t>, nullable)</w:t>
+              <w:spacing w:after="60"/>
+            </w:pPr>
+            <w:r>
+              <w:rPr>
+                <w:rFonts w:ascii="Times New Roman" w:hAnsi="Times New Roman"/>
+                <w:sz w:val="20"/>
+              </w:rPr>
+              <w:t>category_id (FK)</w:t>
             </w:r>
           </w:p>
         </w:tc>
@@ -3861,10 +3819,14 @@
           </w:tcPr>
           <w:p>
             <w:pPr>
-              <w:jc w:val="both"/>
-            </w:pPr>
-            <w:r>
-              <w:t>UUID / BIGINT</w:t>
+              <w:spacing w:after="60"/>
+            </w:pPr>
+            <w:r>
+              <w:rPr>
+                <w:rFonts w:ascii="Times New Roman" w:hAnsi="Times New Roman"/>
+                <w:sz w:val="20"/>
+              </w:rPr>
+              <w:t>Id</w:t>
             </w:r>
           </w:p>
         </w:tc>
@@ -3886,58 +3848,14 @@
           </w:tcPr>
           <w:p>
             <w:pPr>
-              <w:jc w:val="both"/>
-            </w:pPr>
-            <w:r>
-              <w:t xml:space="preserve">Admin yang </w:t>
-            </w:r>
-            <w:proofErr w:type="spellStart"/>
-            <w:r>
-              <w:t>memproses</w:t>
-            </w:r>
-            <w:proofErr w:type="spellEnd"/>
-            <w:r>
-              <w:t xml:space="preserve"> </w:t>
-            </w:r>
-            <w:proofErr w:type="spellStart"/>
-            <w:r>
-              <w:t>moderasi</w:t>
-            </w:r>
-            <w:proofErr w:type="spellEnd"/>
-            <w:r>
-              <w:t xml:space="preserve">; </w:t>
-            </w:r>
-            <w:proofErr w:type="spellStart"/>
-            <w:r>
-              <w:t>kosong</w:t>
-            </w:r>
-            <w:proofErr w:type="spellEnd"/>
-            <w:r>
-              <w:t xml:space="preserve"> </w:t>
-            </w:r>
-            <w:proofErr w:type="spellStart"/>
-            <w:r>
-              <w:t>selama</w:t>
-            </w:r>
-            <w:proofErr w:type="spellEnd"/>
-            <w:r>
-              <w:t xml:space="preserve"> status </w:t>
-            </w:r>
-            <w:proofErr w:type="spellStart"/>
-            <w:r>
-              <w:t>masih</w:t>
-            </w:r>
-            <w:proofErr w:type="spellEnd"/>
-            <w:r>
-              <w:t xml:space="preserve"> “</w:t>
-            </w:r>
-            <w:proofErr w:type="spellStart"/>
-            <w:r>
-              <w:t>diajukan</w:t>
-            </w:r>
-            <w:proofErr w:type="spellEnd"/>
-            <w:r>
-              <w:t>” (US-EVENT-02).</w:t>
+              <w:spacing w:after="60"/>
+            </w:pPr>
+            <w:r>
+              <w:rPr>
+                <w:rFonts w:ascii="Times New Roman" w:hAnsi="Times New Roman"/>
+                <w:sz w:val="20"/>
+              </w:rPr>
+              <w:t>Kategori aktif saat pengajuan.</w:t>
             </w:r>
           </w:p>
         </w:tc>
@@ -3949,6 +3867,9 @@
             <w:bottom w:w="0" w:type="dxa"/>
           </w:tblCellMar>
         </w:tblPrEx>
+        <w:trPr>
+          <w:cantSplit/>
+        </w:trPr>
         <w:tc>
           <w:tcPr>
             <w:tcW w:w="2200" w:type="dxa"/>
@@ -3967,10 +3888,14 @@
           </w:tcPr>
           <w:p>
             <w:pPr>
-              <w:jc w:val="both"/>
-            </w:pPr>
-            <w:r>
-              <w:t>title</w:t>
+              <w:spacing w:after="60"/>
+            </w:pPr>
+            <w:r>
+              <w:rPr>
+                <w:rFonts w:ascii="Times New Roman" w:hAnsi="Times New Roman"/>
+                <w:sz w:val="20"/>
+              </w:rPr>
+              <w:t>moderated_by (FK, nullable)</w:t>
             </w:r>
           </w:p>
         </w:tc>
@@ -3992,15 +3917,14 @@
           </w:tcPr>
           <w:p>
             <w:pPr>
-              <w:jc w:val="both"/>
-            </w:pPr>
-            <w:proofErr w:type="gramStart"/>
-            <w:r>
-              <w:t>VARCHAR(</w:t>
-            </w:r>
-            <w:proofErr w:type="gramEnd"/>
-            <w:r>
-              <w:t>200)</w:t>
+              <w:spacing w:after="60"/>
+            </w:pPr>
+            <w:r>
+              <w:rPr>
+                <w:rFonts w:ascii="Times New Roman" w:hAnsi="Times New Roman"/>
+                <w:sz w:val="20"/>
+              </w:rPr>
+              <w:t>Id</w:t>
             </w:r>
           </w:p>
         </w:tc>
@@ -4022,15 +3946,14 @@
           </w:tcPr>
           <w:p>
             <w:pPr>
-              <w:jc w:val="both"/>
-            </w:pPr>
-            <w:proofErr w:type="spellStart"/>
-            <w:r>
-              <w:t>Judul</w:t>
-            </w:r>
-            <w:proofErr w:type="spellEnd"/>
-            <w:r>
-              <w:t xml:space="preserve"> event (US-EVENT-01).</w:t>
+              <w:spacing w:after="60"/>
+            </w:pPr>
+            <w:r>
+              <w:rPr>
+                <w:rFonts w:ascii="Times New Roman" w:hAnsi="Times New Roman"/>
+                <w:sz w:val="20"/>
+              </w:rPr>
+              <w:t>User admin moderator; NULL sebelum diproses.</w:t>
             </w:r>
           </w:p>
         </w:tc>
@@ -4042,6 +3965,9 @@
             <w:bottom w:w="0" w:type="dxa"/>
           </w:tblCellMar>
         </w:tblPrEx>
+        <w:trPr>
+          <w:cantSplit/>
+        </w:trPr>
         <w:tc>
           <w:tcPr>
             <w:tcW w:w="2200" w:type="dxa"/>
@@ -4060,10 +3986,14 @@
           </w:tcPr>
           <w:p>
             <w:pPr>
-              <w:jc w:val="both"/>
-            </w:pPr>
-            <w:r>
-              <w:t>description</w:t>
+              <w:spacing w:after="60"/>
+            </w:pPr>
+            <w:r>
+              <w:rPr>
+                <w:rFonts w:ascii="Times New Roman" w:hAnsi="Times New Roman"/>
+                <w:sz w:val="20"/>
+              </w:rPr>
+              <w:t>title, description</w:t>
             </w:r>
           </w:p>
         </w:tc>
@@ -4085,10 +4015,14 @@
           </w:tcPr>
           <w:p>
             <w:pPr>
-              <w:jc w:val="both"/>
-            </w:pPr>
-            <w:r>
-              <w:t>TEXT</w:t>
+              <w:spacing w:after="60"/>
+            </w:pPr>
+            <w:r>
+              <w:rPr>
+                <w:rFonts w:ascii="Times New Roman" w:hAnsi="Times New Roman"/>
+                <w:sz w:val="20"/>
+              </w:rPr>
+              <w:t>VARCHAR(200), TEXT</w:t>
             </w:r>
           </w:p>
         </w:tc>
@@ -4110,23 +4044,14 @@
           </w:tcPr>
           <w:p>
             <w:pPr>
-              <w:jc w:val="both"/>
-            </w:pPr>
-            <w:proofErr w:type="spellStart"/>
-            <w:r>
-              <w:t>Deskripsi</w:t>
-            </w:r>
-            <w:proofErr w:type="spellEnd"/>
-            <w:r>
-              <w:t xml:space="preserve"> </w:t>
-            </w:r>
-            <w:proofErr w:type="spellStart"/>
-            <w:r>
-              <w:t>lengkap</w:t>
-            </w:r>
-            <w:proofErr w:type="spellEnd"/>
-            <w:r>
-              <w:t xml:space="preserve"> event.</w:t>
+              <w:spacing w:after="60"/>
+            </w:pPr>
+            <w:r>
+              <w:rPr>
+                <w:rFonts w:ascii="Times New Roman" w:hAnsi="Times New Roman"/>
+                <w:sz w:val="20"/>
+              </w:rPr>
+              <w:t>Judul dan deskripsi.</w:t>
             </w:r>
           </w:p>
         </w:tc>
@@ -4138,6 +4063,9 @@
             <w:bottom w:w="0" w:type="dxa"/>
           </w:tblCellMar>
         </w:tblPrEx>
+        <w:trPr>
+          <w:cantSplit/>
+        </w:trPr>
         <w:tc>
           <w:tcPr>
             <w:tcW w:w="2200" w:type="dxa"/>
@@ -4156,13 +4084,15 @@
           </w:tcPr>
           <w:p>
             <w:pPr>
-              <w:jc w:val="both"/>
-            </w:pPr>
-            <w:proofErr w:type="spellStart"/>
-            <w:r>
-              <w:t>date_time</w:t>
-            </w:r>
-            <w:proofErr w:type="spellEnd"/>
+              <w:spacing w:after="60"/>
+            </w:pPr>
+            <w:r>
+              <w:rPr>
+                <w:rFonts w:ascii="Times New Roman" w:hAnsi="Times New Roman"/>
+                <w:sz w:val="20"/>
+              </w:rPr>
+              <w:t>start_at, end_at</w:t>
+            </w:r>
           </w:p>
         </w:tc>
         <w:tc>
@@ -4183,10 +4113,14 @@
           </w:tcPr>
           <w:p>
             <w:pPr>
-              <w:jc w:val="both"/>
-            </w:pPr>
-            <w:r>
-              <w:t>DATETIME</w:t>
+              <w:spacing w:after="60"/>
+            </w:pPr>
+            <w:r>
+              <w:rPr>
+                <w:rFonts w:ascii="Times New Roman" w:hAnsi="Times New Roman"/>
+                <w:sz w:val="20"/>
+              </w:rPr>
+              <w:t>TIMESTAMP</w:t>
             </w:r>
           </w:p>
         </w:tc>
@@ -4208,42 +4142,14 @@
           </w:tcPr>
           <w:p>
             <w:pPr>
-              <w:jc w:val="both"/>
-            </w:pPr>
-            <w:r>
-              <w:t xml:space="preserve">Jadwal </w:t>
-            </w:r>
-            <w:proofErr w:type="spellStart"/>
-            <w:r>
-              <w:t>pelaksanaan</w:t>
-            </w:r>
-            <w:proofErr w:type="spellEnd"/>
-            <w:r>
-              <w:t xml:space="preserve"> event; </w:t>
-            </w:r>
-            <w:proofErr w:type="spellStart"/>
-            <w:r>
-              <w:t>diindeks</w:t>
-            </w:r>
-            <w:proofErr w:type="spellEnd"/>
-            <w:r>
-              <w:t xml:space="preserve"> </w:t>
-            </w:r>
-            <w:proofErr w:type="spellStart"/>
-            <w:r>
-              <w:t>untuk</w:t>
-            </w:r>
-            <w:proofErr w:type="spellEnd"/>
-            <w:r>
-              <w:t xml:space="preserve"> </w:t>
-            </w:r>
-            <w:proofErr w:type="spellStart"/>
-            <w:r>
-              <w:t>pencarian</w:t>
-            </w:r>
-            <w:proofErr w:type="spellEnd"/>
-            <w:r>
-              <w:t xml:space="preserve"> (NFR-SCAL-02).</w:t>
+              <w:spacing w:after="60"/>
+            </w:pPr>
+            <w:r>
+              <w:rPr>
+                <w:rFonts w:ascii="Times New Roman" w:hAnsi="Times New Roman"/>
+                <w:sz w:val="20"/>
+              </w:rPr>
+              <w:t>Waktu mulai dan selesai; end_at &gt; start_at; zona waktu konsisten.</w:t>
             </w:r>
           </w:p>
         </w:tc>
@@ -4255,6 +4161,9 @@
             <w:bottom w:w="0" w:type="dxa"/>
           </w:tblCellMar>
         </w:tblPrEx>
+        <w:trPr>
+          <w:cantSplit/>
+        </w:trPr>
         <w:tc>
           <w:tcPr>
             <w:tcW w:w="2200" w:type="dxa"/>
@@ -4273,13 +4182,15 @@
           </w:tcPr>
           <w:p>
             <w:pPr>
-              <w:jc w:val="both"/>
-            </w:pPr>
-            <w:proofErr w:type="spellStart"/>
-            <w:r>
-              <w:t>location_or_link</w:t>
-            </w:r>
-            <w:proofErr w:type="spellEnd"/>
+              <w:spacing w:after="60"/>
+            </w:pPr>
+            <w:r>
+              <w:rPr>
+                <w:rFonts w:ascii="Times New Roman" w:hAnsi="Times New Roman"/>
+                <w:sz w:val="20"/>
+              </w:rPr>
+              <w:t>location_or_link, poster_url</w:t>
+            </w:r>
           </w:p>
         </w:tc>
         <w:tc>
@@ -4300,15 +4211,14 @@
           </w:tcPr>
           <w:p>
             <w:pPr>
-              <w:jc w:val="both"/>
-            </w:pPr>
-            <w:proofErr w:type="gramStart"/>
-            <w:r>
-              <w:t>VARCHAR(</w:t>
-            </w:r>
-            <w:proofErr w:type="gramEnd"/>
-            <w:r>
-              <w:t>255)</w:t>
+              <w:spacing w:after="60"/>
+            </w:pPr>
+            <w:r>
+              <w:rPr>
+                <w:rFonts w:ascii="Times New Roman" w:hAnsi="Times New Roman"/>
+                <w:sz w:val="20"/>
+              </w:rPr>
+              <w:t>VARCHAR(255)</w:t>
             </w:r>
           </w:p>
         </w:tc>
@@ -4330,34 +4240,14 @@
           </w:tcPr>
           <w:p>
             <w:pPr>
-              <w:jc w:val="both"/>
-            </w:pPr>
-            <w:r>
-              <w:t xml:space="preserve">Lokasi </w:t>
-            </w:r>
-            <w:proofErr w:type="spellStart"/>
-            <w:r>
-              <w:t>fisik</w:t>
-            </w:r>
-            <w:proofErr w:type="spellEnd"/>
-            <w:r>
-              <w:t xml:space="preserve"> </w:t>
-            </w:r>
-            <w:proofErr w:type="spellStart"/>
-            <w:r>
-              <w:t>atau</w:t>
-            </w:r>
-            <w:proofErr w:type="spellEnd"/>
-            <w:r>
-              <w:t xml:space="preserve"> </w:t>
-            </w:r>
-            <w:proofErr w:type="spellStart"/>
-            <w:r>
-              <w:t>tautan</w:t>
-            </w:r>
-            <w:proofErr w:type="spellEnd"/>
-            <w:r>
-              <w:t xml:space="preserve"> online event.</w:t>
+              <w:spacing w:after="60"/>
+            </w:pPr>
+            <w:r>
+              <w:rPr>
+                <w:rFonts w:ascii="Times New Roman" w:hAnsi="Times New Roman"/>
+                <w:sz w:val="20"/>
+              </w:rPr>
+              <w:t>Lokasi/tautan dan poster tervalidasi.</w:t>
             </w:r>
           </w:p>
         </w:tc>
@@ -4369,6 +4259,9 @@
             <w:bottom w:w="0" w:type="dxa"/>
           </w:tblCellMar>
         </w:tblPrEx>
+        <w:trPr>
+          <w:cantSplit/>
+        </w:trPr>
         <w:tc>
           <w:tcPr>
             <w:tcW w:w="2200" w:type="dxa"/>
@@ -4387,13 +4280,15 @@
           </w:tcPr>
           <w:p>
             <w:pPr>
-              <w:jc w:val="both"/>
-            </w:pPr>
-            <w:proofErr w:type="spellStart"/>
-            <w:r>
-              <w:t>poster_url</w:t>
-            </w:r>
-            <w:proofErr w:type="spellEnd"/>
+              <w:spacing w:after="60"/>
+            </w:pPr>
+            <w:r>
+              <w:rPr>
+                <w:rFonts w:ascii="Times New Roman" w:hAnsi="Times New Roman"/>
+                <w:sz w:val="20"/>
+              </w:rPr>
+              <w:t>quota</w:t>
+            </w:r>
           </w:p>
         </w:tc>
         <w:tc>
@@ -4414,15 +4309,14 @@
           </w:tcPr>
           <w:p>
             <w:pPr>
-              <w:jc w:val="both"/>
-            </w:pPr>
-            <w:proofErr w:type="gramStart"/>
-            <w:r>
-              <w:t>VARCHAR(</w:t>
-            </w:r>
-            <w:proofErr w:type="gramEnd"/>
-            <w:r>
-              <w:t>255)</w:t>
+              <w:spacing w:after="60"/>
+            </w:pPr>
+            <w:r>
+              <w:rPr>
+                <w:rFonts w:ascii="Times New Roman" w:hAnsi="Times New Roman"/>
+                <w:sz w:val="20"/>
+              </w:rPr>
+              <w:t>INT</w:t>
             </w:r>
           </w:p>
         </w:tc>
@@ -4444,23 +4338,14 @@
           </w:tcPr>
           <w:p>
             <w:pPr>
-              <w:jc w:val="both"/>
-            </w:pPr>
-            <w:proofErr w:type="spellStart"/>
-            <w:r>
-              <w:t>Tautan</w:t>
-            </w:r>
-            <w:proofErr w:type="spellEnd"/>
-            <w:r>
-              <w:t xml:space="preserve"> </w:t>
-            </w:r>
-            <w:proofErr w:type="spellStart"/>
-            <w:r>
-              <w:t>berkas</w:t>
-            </w:r>
-            <w:proofErr w:type="spellEnd"/>
-            <w:r>
-              <w:t xml:space="preserve"> poster event.</w:t>
+              <w:spacing w:after="60"/>
+            </w:pPr>
+            <w:r>
+              <w:rPr>
+                <w:rFonts w:ascii="Times New Roman" w:hAnsi="Times New Roman"/>
+                <w:sz w:val="20"/>
+              </w:rPr>
+              <w:t>Kuota &gt; 0.</w:t>
             </w:r>
           </w:p>
         </w:tc>
@@ -4472,6 +4357,9 @@
             <w:bottom w:w="0" w:type="dxa"/>
           </w:tblCellMar>
         </w:tblPrEx>
+        <w:trPr>
+          <w:cantSplit/>
+        </w:trPr>
         <w:tc>
           <w:tcPr>
             <w:tcW w:w="2200" w:type="dxa"/>
@@ -4490,10 +4378,14 @@
           </w:tcPr>
           <w:p>
             <w:pPr>
-              <w:jc w:val="both"/>
-            </w:pPr>
-            <w:r>
-              <w:t>quota</w:t>
+              <w:spacing w:after="60"/>
+            </w:pPr>
+            <w:r>
+              <w:rPr>
+                <w:rFonts w:ascii="Times New Roman" w:hAnsi="Times New Roman"/>
+                <w:sz w:val="20"/>
+              </w:rPr>
+              <w:t>status</w:t>
             </w:r>
           </w:p>
         </w:tc>
@@ -4515,10 +4407,14 @@
           </w:tcPr>
           <w:p>
             <w:pPr>
-              <w:jc w:val="both"/>
-            </w:pPr>
-            <w:r>
-              <w:t>INT</w:t>
+              <w:spacing w:after="60"/>
+            </w:pPr>
+            <w:r>
+              <w:rPr>
+                <w:rFonts w:ascii="Times New Roman" w:hAnsi="Times New Roman"/>
+                <w:sz w:val="20"/>
+              </w:rPr>
+              <w:t>ENUM</w:t>
             </w:r>
           </w:p>
         </w:tc>
@@ -4540,31 +4436,14 @@
           </w:tcPr>
           <w:p>
             <w:pPr>
-              <w:jc w:val="both"/>
-            </w:pPr>
-            <w:proofErr w:type="spellStart"/>
-            <w:r>
-              <w:t>Kuota</w:t>
-            </w:r>
-            <w:proofErr w:type="spellEnd"/>
-            <w:r>
-              <w:t xml:space="preserve"> </w:t>
-            </w:r>
-            <w:proofErr w:type="spellStart"/>
-            <w:r>
-              <w:t>jumlah</w:t>
-            </w:r>
-            <w:proofErr w:type="spellEnd"/>
-            <w:r>
-              <w:t xml:space="preserve"> </w:t>
-            </w:r>
-            <w:proofErr w:type="spellStart"/>
-            <w:r>
-              <w:t>peserta</w:t>
-            </w:r>
-            <w:proofErr w:type="spellEnd"/>
-            <w:r>
-              <w:t>.</w:t>
+              <w:spacing w:after="60"/>
+            </w:pPr>
+            <w:r>
+              <w:rPr>
+                <w:rFonts w:ascii="Times New Roman" w:hAnsi="Times New Roman"/>
+                <w:sz w:val="20"/>
+              </w:rPr>
+              <w:t>draft | menunggu_moderasi | disetujui | ditolak | selesai | dibatalkan.</w:t>
             </w:r>
           </w:p>
         </w:tc>
@@ -4576,6 +4455,9 @@
             <w:bottom w:w="0" w:type="dxa"/>
           </w:tblCellMar>
         </w:tblPrEx>
+        <w:trPr>
+          <w:cantSplit/>
+        </w:trPr>
         <w:tc>
           <w:tcPr>
             <w:tcW w:w="2200" w:type="dxa"/>
@@ -4594,10 +4476,14 @@
           </w:tcPr>
           <w:p>
             <w:pPr>
-              <w:jc w:val="both"/>
-            </w:pPr>
-            <w:r>
-              <w:t>status</w:t>
+              <w:spacing w:after="60"/>
+            </w:pPr>
+            <w:r>
+              <w:rPr>
+                <w:rFonts w:ascii="Times New Roman" w:hAnsi="Times New Roman"/>
+                <w:sz w:val="20"/>
+              </w:rPr>
+              <w:t>rejection_reason (nullable)</w:t>
             </w:r>
           </w:p>
         </w:tc>
@@ -4619,10 +4505,14 @@
           </w:tcPr>
           <w:p>
             <w:pPr>
-              <w:jc w:val="both"/>
-            </w:pPr>
-            <w:r>
-              <w:t>ENUM</w:t>
+              <w:spacing w:after="60"/>
+            </w:pPr>
+            <w:r>
+              <w:rPr>
+                <w:rFonts w:ascii="Times New Roman" w:hAnsi="Times New Roman"/>
+                <w:sz w:val="20"/>
+              </w:rPr>
+              <w:t>TEXT</w:t>
             </w:r>
           </w:p>
         </w:tc>
@@ -4644,55 +4534,14 @@
           </w:tcPr>
           <w:p>
             <w:pPr>
-              <w:jc w:val="both"/>
-            </w:pPr>
-            <w:proofErr w:type="spellStart"/>
-            <w:r>
-              <w:t>diajukan</w:t>
-            </w:r>
-            <w:proofErr w:type="spellEnd"/>
-            <w:r>
-              <w:t xml:space="preserve"> | </w:t>
-            </w:r>
-            <w:proofErr w:type="spellStart"/>
-            <w:r>
-              <w:t>disetujui</w:t>
-            </w:r>
-            <w:proofErr w:type="spellEnd"/>
-            <w:r>
-              <w:t xml:space="preserve"> | </w:t>
-            </w:r>
-            <w:proofErr w:type="spellStart"/>
-            <w:r>
-              <w:t>ditolak</w:t>
-            </w:r>
-            <w:proofErr w:type="spellEnd"/>
-            <w:r>
-              <w:t xml:space="preserve"> | </w:t>
-            </w:r>
-            <w:proofErr w:type="spellStart"/>
-            <w:r>
-              <w:t>selesai</w:t>
-            </w:r>
-            <w:proofErr w:type="spellEnd"/>
-            <w:r>
-              <w:t xml:space="preserve"> — </w:t>
-            </w:r>
-            <w:proofErr w:type="spellStart"/>
-            <w:r>
-              <w:t>siklus</w:t>
-            </w:r>
-            <w:proofErr w:type="spellEnd"/>
-            <w:r>
-              <w:t xml:space="preserve"> status </w:t>
-            </w:r>
-            <w:proofErr w:type="spellStart"/>
-            <w:r>
-              <w:t>moderasi</w:t>
-            </w:r>
-            <w:proofErr w:type="spellEnd"/>
-            <w:r>
-              <w:t xml:space="preserve"> (US-EVENT-02, US-EVENT-03).</w:t>
+              <w:spacing w:after="60"/>
+            </w:pPr>
+            <w:r>
+              <w:rPr>
+                <w:rFonts w:ascii="Times New Roman" w:hAnsi="Times New Roman"/>
+                <w:sz w:val="20"/>
+              </w:rPr>
+              <w:t>Wajib pada keputusan ditolak.</w:t>
             </w:r>
           </w:p>
         </w:tc>
@@ -4704,6 +4553,9 @@
             <w:bottom w:w="0" w:type="dxa"/>
           </w:tblCellMar>
         </w:tblPrEx>
+        <w:trPr>
+          <w:cantSplit/>
+        </w:trPr>
         <w:tc>
           <w:tcPr>
             <w:tcW w:w="2200" w:type="dxa"/>
@@ -4722,13 +4574,15 @@
           </w:tcPr>
           <w:p>
             <w:pPr>
-              <w:jc w:val="both"/>
-            </w:pPr>
-            <w:proofErr w:type="spellStart"/>
-            <w:r>
-              <w:t>created_at</w:t>
-            </w:r>
-            <w:proofErr w:type="spellEnd"/>
+              <w:spacing w:after="60"/>
+            </w:pPr>
+            <w:r>
+              <w:rPr>
+                <w:rFonts w:ascii="Times New Roman" w:hAnsi="Times New Roman"/>
+                <w:sz w:val="20"/>
+              </w:rPr>
+              <w:t>created_at, updated_at</w:t>
+            </w:r>
           </w:p>
         </w:tc>
         <w:tc>
@@ -4749,9 +4603,13 @@
           </w:tcPr>
           <w:p>
             <w:pPr>
-              <w:jc w:val="both"/>
-            </w:pPr>
-            <w:r>
+              <w:spacing w:after="60"/>
+            </w:pPr>
+            <w:r>
+              <w:rPr>
+                <w:rFonts w:ascii="Times New Roman" w:hAnsi="Times New Roman"/>
+                <w:sz w:val="20"/>
+              </w:rPr>
               <w:t>TIMESTAMP</w:t>
             </w:r>
           </w:p>
@@ -4774,143 +4632,627 @@
           </w:tcPr>
           <w:p>
             <w:pPr>
-              <w:jc w:val="both"/>
-            </w:pPr>
-            <w:r>
-              <w:t xml:space="preserve">Waktu event </w:t>
-            </w:r>
-            <w:proofErr w:type="spellStart"/>
-            <w:r>
-              <w:t>diajukan</w:t>
-            </w:r>
-            <w:proofErr w:type="spellEnd"/>
-            <w:r>
-              <w:t>.</w:t>
+              <w:spacing w:after="60"/>
+            </w:pPr>
+            <w:r>
+              <w:rPr>
+                <w:rFonts w:ascii="Times New Roman" w:hAnsi="Times New Roman"/>
+                <w:sz w:val="20"/>
+              </w:rPr>
+              <w:t>Waktu pembuatan dan perubahan event.</w:t>
+            </w:r>
+          </w:p>
+        </w:tc>
+      </w:tr>
+    </w:tbl>
+    <w:p>
+      <w:pPr/>
+      <w:r>
+        <w:rPr>
+          <w:rFonts w:ascii="Times New Roman" w:hAnsi="Times New Roman"/>
+          <w:b/>
+          <w:i/>
+          <w:sz w:val="20"/>
+        </w:rPr>
+        <w:t>3.4 Entitas Organization pada Modul Auth</w:t>
+      </w:r>
+    </w:p>
+    <w:tbl>
+      <w:tblPr>
+        <w:tblW w:w="9600" w:type="dxa"/>
+        <w:tblBorders>
+          <w:top w:val="single" w:sz="4" w:space="0" w:color="auto"/>
+          <w:left w:val="single" w:sz="4" w:space="0" w:color="auto"/>
+          <w:bottom w:val="single" w:sz="4" w:space="0" w:color="auto"/>
+          <w:right w:val="single" w:sz="4" w:space="0" w:color="auto"/>
+          <w:insideH w:val="single" w:sz="4" w:space="0" w:color="auto"/>
+          <w:insideV w:val="single" w:sz="4" w:space="0" w:color="auto"/>
+        </w:tblBorders>
+        <w:tblLayout w:type="fixed"/>
+        <w:tblCellMar>
+          <w:left w:w="10" w:type="dxa"/>
+          <w:right w:w="10" w:type="dxa"/>
+        </w:tblCellMar>
+        <w:tblLook w:val="04A0" w:firstRow="1" w:lastRow="0" w:firstColumn="1" w:lastColumn="0" w:noHBand="0" w:noVBand="1"/>
+      </w:tblPr>
+      <w:tblGrid>
+        <w:gridCol w:w="2203"/>
+        <w:gridCol w:w="2203"/>
+        <w:gridCol w:w="5198"/>
+      </w:tblGrid>
+      <w:tr>
+        <w:trPr>
+          <w:cantSplit/>
+          <w:tblHeader/>
+        </w:trPr>
+        <w:tc>
+          <w:tcPr>
+            <w:tcW w:w="2203" w:type="dxa"/>
+            <w:tcBorders>
+              <w:top w:val="single" w:sz="4" w:space="0" w:color="2F5496"/>
+              <w:left w:val="single" w:sz="4" w:space="0" w:color="2F5496"/>
+              <w:bottom w:val="single" w:sz="4" w:space="0" w:color="2F5496"/>
+              <w:right w:val="single" w:sz="4" w:space="0" w:color="2F5496"/>
+            </w:tcBorders>
+            <w:shd w:val="clear" w:color="auto" w:fill="2F5496"/>
+            <w:tcMar>
+              <w:top w:w="80" w:type="dxa"/>
+              <w:left w:w="100" w:type="dxa"/>
+              <w:bottom w:w="80" w:type="dxa"/>
+              <w:right w:w="100" w:type="dxa"/>
+            </w:tcMar>
+          </w:tcPr>
+          <w:p>
+            <w:pPr>
+              <w:spacing w:after="60"/>
+            </w:pPr>
+            <w:r>
+              <w:rPr>
+                <w:rFonts w:ascii="Times New Roman" w:hAnsi="Times New Roman"/>
+                <w:b/>
+                <w:color w:val="FFFFFF"/>
+                <w:sz w:val="20"/>
+              </w:rPr>
+              <w:t>Atribut</w:t>
+            </w:r>
+          </w:p>
+        </w:tc>
+        <w:tc>
+          <w:tcPr>
+            <w:tcW w:w="2203" w:type="dxa"/>
+            <w:tcBorders>
+              <w:top w:val="single" w:sz="4" w:space="0" w:color="2F5496"/>
+              <w:left w:val="single" w:sz="4" w:space="0" w:color="2F5496"/>
+              <w:bottom w:val="single" w:sz="4" w:space="0" w:color="2F5496"/>
+              <w:right w:val="single" w:sz="4" w:space="0" w:color="2F5496"/>
+            </w:tcBorders>
+            <w:shd w:val="clear" w:color="auto" w:fill="2F5496"/>
+            <w:tcMar>
+              <w:top w:w="80" w:type="dxa"/>
+              <w:left w:w="100" w:type="dxa"/>
+              <w:bottom w:w="80" w:type="dxa"/>
+              <w:right w:w="100" w:type="dxa"/>
+            </w:tcMar>
+          </w:tcPr>
+          <w:p>
+            <w:pPr>
+              <w:spacing w:after="60"/>
+            </w:pPr>
+            <w:r>
+              <w:rPr>
+                <w:rFonts w:ascii="Times New Roman" w:hAnsi="Times New Roman"/>
+                <w:b/>
+                <w:color w:val="FFFFFF"/>
+                <w:sz w:val="20"/>
+              </w:rPr>
+              <w:t>Tipe Data</w:t>
+            </w:r>
+          </w:p>
+        </w:tc>
+        <w:tc>
+          <w:tcPr>
+            <w:tcW w:w="5198" w:type="dxa"/>
+            <w:tcBorders>
+              <w:top w:val="single" w:sz="4" w:space="0" w:color="2F5496"/>
+              <w:left w:val="single" w:sz="4" w:space="0" w:color="2F5496"/>
+              <w:bottom w:val="single" w:sz="4" w:space="0" w:color="2F5496"/>
+              <w:right w:val="single" w:sz="4" w:space="0" w:color="2F5496"/>
+            </w:tcBorders>
+            <w:shd w:val="clear" w:color="auto" w:fill="2F5496"/>
+            <w:tcMar>
+              <w:top w:w="80" w:type="dxa"/>
+              <w:left w:w="100" w:type="dxa"/>
+              <w:bottom w:w="80" w:type="dxa"/>
+              <w:right w:w="100" w:type="dxa"/>
+            </w:tcMar>
+          </w:tcPr>
+          <w:p>
+            <w:pPr>
+              <w:spacing w:after="60"/>
+            </w:pPr>
+            <w:r>
+              <w:rPr>
+                <w:rFonts w:ascii="Times New Roman" w:hAnsi="Times New Roman"/>
+                <w:b/>
+                <w:color w:val="FFFFFF"/>
+                <w:sz w:val="20"/>
+              </w:rPr>
+              <w:t>Keterangan</w:t>
             </w:r>
           </w:p>
         </w:tc>
       </w:tr>
       <w:tr>
-        <w:tblPrEx>
-          <w:tblCellMar>
-            <w:top w:w="0" w:type="dxa"/>
-            <w:bottom w:w="0" w:type="dxa"/>
-          </w:tblCellMar>
-        </w:tblPrEx>
-        <w:tc>
-          <w:tcPr>
-            <w:tcW w:w="2200" w:type="dxa"/>
-            <w:tcBorders>
-              <w:top w:val="single" w:sz="4" w:space="0" w:color="999999"/>
-              <w:left w:val="single" w:sz="4" w:space="0" w:color="999999"/>
-              <w:bottom w:val="single" w:sz="4" w:space="0" w:color="999999"/>
-              <w:right w:val="single" w:sz="4" w:space="0" w:color="999999"/>
-            </w:tcBorders>
-            <w:tcMar>
-              <w:top w:w="80" w:type="dxa"/>
-              <w:left w:w="100" w:type="dxa"/>
-              <w:bottom w:w="80" w:type="dxa"/>
-              <w:right w:w="100" w:type="dxa"/>
-            </w:tcMar>
-          </w:tcPr>
-          <w:p>
-            <w:pPr>
-              <w:jc w:val="both"/>
-            </w:pPr>
-            <w:proofErr w:type="spellStart"/>
-            <w:r>
-              <w:t>updated_at</w:t>
-            </w:r>
-            <w:proofErr w:type="spellEnd"/>
-          </w:p>
-        </w:tc>
-        <w:tc>
-          <w:tcPr>
-            <w:tcW w:w="2200" w:type="dxa"/>
-            <w:tcBorders>
-              <w:top w:val="single" w:sz="4" w:space="0" w:color="999999"/>
-              <w:left w:val="single" w:sz="4" w:space="0" w:color="999999"/>
-              <w:bottom w:val="single" w:sz="4" w:space="0" w:color="999999"/>
-              <w:right w:val="single" w:sz="4" w:space="0" w:color="999999"/>
-            </w:tcBorders>
-            <w:tcMar>
-              <w:top w:w="80" w:type="dxa"/>
-              <w:left w:w="100" w:type="dxa"/>
-              <w:bottom w:w="80" w:type="dxa"/>
-              <w:right w:w="100" w:type="dxa"/>
-            </w:tcMar>
-          </w:tcPr>
-          <w:p>
-            <w:pPr>
-              <w:jc w:val="both"/>
-            </w:pPr>
-            <w:r>
+        <w:trPr>
+          <w:cantSplit/>
+        </w:trPr>
+        <w:tc>
+          <w:tcPr>
+            <w:tcW w:w="2203" w:type="dxa"/>
+            <w:tcBorders>
+              <w:top w:val="single" w:sz="4" w:space="0" w:color="999999"/>
+              <w:left w:val="single" w:sz="4" w:space="0" w:color="999999"/>
+              <w:bottom w:val="single" w:sz="4" w:space="0" w:color="999999"/>
+              <w:right w:val="single" w:sz="4" w:space="0" w:color="999999"/>
+            </w:tcBorders>
+            <w:tcMar>
+              <w:top w:w="80" w:type="dxa"/>
+              <w:left w:w="100" w:type="dxa"/>
+              <w:bottom w:w="80" w:type="dxa"/>
+              <w:right w:w="100" w:type="dxa"/>
+            </w:tcMar>
+          </w:tcPr>
+          <w:p>
+            <w:pPr>
+              <w:spacing w:after="60"/>
+            </w:pPr>
+            <w:r>
+              <w:rPr>
+                <w:rFonts w:ascii="Times New Roman" w:hAnsi="Times New Roman"/>
+                <w:b w:val="0"/>
+                <w:sz w:val="20"/>
+              </w:rPr>
+              <w:t>organization_id (PK)</w:t>
+            </w:r>
+          </w:p>
+        </w:tc>
+        <w:tc>
+          <w:tcPr>
+            <w:tcW w:w="2203" w:type="dxa"/>
+            <w:tcBorders>
+              <w:top w:val="single" w:sz="4" w:space="0" w:color="999999"/>
+              <w:left w:val="single" w:sz="4" w:space="0" w:color="999999"/>
+              <w:bottom w:val="single" w:sz="4" w:space="0" w:color="999999"/>
+              <w:right w:val="single" w:sz="4" w:space="0" w:color="999999"/>
+            </w:tcBorders>
+            <w:tcMar>
+              <w:top w:w="80" w:type="dxa"/>
+              <w:left w:w="100" w:type="dxa"/>
+              <w:bottom w:w="80" w:type="dxa"/>
+              <w:right w:w="100" w:type="dxa"/>
+            </w:tcMar>
+          </w:tcPr>
+          <w:p>
+            <w:pPr>
+              <w:spacing w:after="60"/>
+            </w:pPr>
+            <w:r>
+              <w:rPr>
+                <w:rFonts w:ascii="Times New Roman" w:hAnsi="Times New Roman"/>
+                <w:b w:val="0"/>
+                <w:sz w:val="20"/>
+              </w:rPr>
+              <w:t>Id</w:t>
+            </w:r>
+          </w:p>
+        </w:tc>
+        <w:tc>
+          <w:tcPr>
+            <w:tcW w:w="5198" w:type="dxa"/>
+            <w:tcBorders>
+              <w:top w:val="single" w:sz="4" w:space="0" w:color="999999"/>
+              <w:left w:val="single" w:sz="4" w:space="0" w:color="999999"/>
+              <w:bottom w:val="single" w:sz="4" w:space="0" w:color="999999"/>
+              <w:right w:val="single" w:sz="4" w:space="0" w:color="999999"/>
+            </w:tcBorders>
+            <w:tcMar>
+              <w:top w:w="80" w:type="dxa"/>
+              <w:left w:w="100" w:type="dxa"/>
+              <w:bottom w:w="80" w:type="dxa"/>
+              <w:right w:w="100" w:type="dxa"/>
+            </w:tcMar>
+          </w:tcPr>
+          <w:p>
+            <w:pPr>
+              <w:spacing w:after="60"/>
+            </w:pPr>
+            <w:r>
+              <w:rPr>
+                <w:rFonts w:ascii="Times New Roman" w:hAnsi="Times New Roman"/>
+                <w:b w:val="0"/>
+                <w:sz w:val="20"/>
+              </w:rPr>
+              <w:t>Primary key organisasi.</w:t>
+            </w:r>
+          </w:p>
+        </w:tc>
+      </w:tr>
+      <w:tr>
+        <w:trPr>
+          <w:cantSplit/>
+        </w:trPr>
+        <w:tc>
+          <w:tcPr>
+            <w:tcW w:w="2203" w:type="dxa"/>
+            <w:tcBorders>
+              <w:top w:val="single" w:sz="4" w:space="0" w:color="999999"/>
+              <w:left w:val="single" w:sz="4" w:space="0" w:color="999999"/>
+              <w:bottom w:val="single" w:sz="4" w:space="0" w:color="999999"/>
+              <w:right w:val="single" w:sz="4" w:space="0" w:color="999999"/>
+            </w:tcBorders>
+            <w:tcMar>
+              <w:top w:w="80" w:type="dxa"/>
+              <w:left w:w="100" w:type="dxa"/>
+              <w:bottom w:w="80" w:type="dxa"/>
+              <w:right w:w="100" w:type="dxa"/>
+            </w:tcMar>
+          </w:tcPr>
+          <w:p>
+            <w:pPr>
+              <w:spacing w:after="60"/>
+            </w:pPr>
+            <w:r>
+              <w:rPr>
+                <w:rFonts w:ascii="Times New Roman" w:hAnsi="Times New Roman"/>
+                <w:b w:val="0"/>
+                <w:sz w:val="20"/>
+              </w:rPr>
+              <w:t>name, type</w:t>
+            </w:r>
+          </w:p>
+        </w:tc>
+        <w:tc>
+          <w:tcPr>
+            <w:tcW w:w="2203" w:type="dxa"/>
+            <w:tcBorders>
+              <w:top w:val="single" w:sz="4" w:space="0" w:color="999999"/>
+              <w:left w:val="single" w:sz="4" w:space="0" w:color="999999"/>
+              <w:bottom w:val="single" w:sz="4" w:space="0" w:color="999999"/>
+              <w:right w:val="single" w:sz="4" w:space="0" w:color="999999"/>
+            </w:tcBorders>
+            <w:tcMar>
+              <w:top w:w="80" w:type="dxa"/>
+              <w:left w:w="100" w:type="dxa"/>
+              <w:bottom w:w="80" w:type="dxa"/>
+              <w:right w:w="100" w:type="dxa"/>
+            </w:tcMar>
+          </w:tcPr>
+          <w:p>
+            <w:pPr>
+              <w:spacing w:after="60"/>
+            </w:pPr>
+            <w:r>
+              <w:rPr>
+                <w:rFonts w:ascii="Times New Roman" w:hAnsi="Times New Roman"/>
+                <w:b w:val="0"/>
+                <w:sz w:val="20"/>
+              </w:rPr>
+              <w:t>VARCHAR</w:t>
+            </w:r>
+          </w:p>
+        </w:tc>
+        <w:tc>
+          <w:tcPr>
+            <w:tcW w:w="5198" w:type="dxa"/>
+            <w:tcBorders>
+              <w:top w:val="single" w:sz="4" w:space="0" w:color="999999"/>
+              <w:left w:val="single" w:sz="4" w:space="0" w:color="999999"/>
+              <w:bottom w:val="single" w:sz="4" w:space="0" w:color="999999"/>
+              <w:right w:val="single" w:sz="4" w:space="0" w:color="999999"/>
+            </w:tcBorders>
+            <w:tcMar>
+              <w:top w:w="80" w:type="dxa"/>
+              <w:left w:w="100" w:type="dxa"/>
+              <w:bottom w:w="80" w:type="dxa"/>
+              <w:right w:w="100" w:type="dxa"/>
+            </w:tcMar>
+          </w:tcPr>
+          <w:p>
+            <w:pPr>
+              <w:spacing w:after="60"/>
+            </w:pPr>
+            <w:r>
+              <w:rPr>
+                <w:rFonts w:ascii="Times New Roman" w:hAnsi="Times New Roman"/>
+                <w:b w:val="0"/>
+                <w:sz w:val="20"/>
+              </w:rPr>
+              <w:t>Nama dan jenis UKM/Ormawa/Fakultas/panitia.</w:t>
+            </w:r>
+          </w:p>
+        </w:tc>
+      </w:tr>
+      <w:tr>
+        <w:trPr>
+          <w:cantSplit/>
+        </w:trPr>
+        <w:tc>
+          <w:tcPr>
+            <w:tcW w:w="2203" w:type="dxa"/>
+            <w:tcBorders>
+              <w:top w:val="single" w:sz="4" w:space="0" w:color="999999"/>
+              <w:left w:val="single" w:sz="4" w:space="0" w:color="999999"/>
+              <w:bottom w:val="single" w:sz="4" w:space="0" w:color="999999"/>
+              <w:right w:val="single" w:sz="4" w:space="0" w:color="999999"/>
+            </w:tcBorders>
+            <w:tcMar>
+              <w:top w:w="80" w:type="dxa"/>
+              <w:left w:w="100" w:type="dxa"/>
+              <w:bottom w:w="80" w:type="dxa"/>
+              <w:right w:w="100" w:type="dxa"/>
+            </w:tcMar>
+          </w:tcPr>
+          <w:p>
+            <w:pPr>
+              <w:spacing w:after="60"/>
+            </w:pPr>
+            <w:r>
+              <w:rPr>
+                <w:rFonts w:ascii="Times New Roman" w:hAnsi="Times New Roman"/>
+                <w:b w:val="0"/>
+                <w:sz w:val="20"/>
+              </w:rPr>
+              <w:t>status</w:t>
+            </w:r>
+          </w:p>
+        </w:tc>
+        <w:tc>
+          <w:tcPr>
+            <w:tcW w:w="2203" w:type="dxa"/>
+            <w:tcBorders>
+              <w:top w:val="single" w:sz="4" w:space="0" w:color="999999"/>
+              <w:left w:val="single" w:sz="4" w:space="0" w:color="999999"/>
+              <w:bottom w:val="single" w:sz="4" w:space="0" w:color="999999"/>
+              <w:right w:val="single" w:sz="4" w:space="0" w:color="999999"/>
+            </w:tcBorders>
+            <w:tcMar>
+              <w:top w:w="80" w:type="dxa"/>
+              <w:left w:w="100" w:type="dxa"/>
+              <w:bottom w:w="80" w:type="dxa"/>
+              <w:right w:w="100" w:type="dxa"/>
+            </w:tcMar>
+          </w:tcPr>
+          <w:p>
+            <w:pPr>
+              <w:spacing w:after="60"/>
+            </w:pPr>
+            <w:r>
+              <w:rPr>
+                <w:rFonts w:ascii="Times New Roman" w:hAnsi="Times New Roman"/>
+                <w:b w:val="0"/>
+                <w:sz w:val="20"/>
+              </w:rPr>
+              <w:t>ENUM</w:t>
+            </w:r>
+          </w:p>
+        </w:tc>
+        <w:tc>
+          <w:tcPr>
+            <w:tcW w:w="5198" w:type="dxa"/>
+            <w:tcBorders>
+              <w:top w:val="single" w:sz="4" w:space="0" w:color="999999"/>
+              <w:left w:val="single" w:sz="4" w:space="0" w:color="999999"/>
+              <w:bottom w:val="single" w:sz="4" w:space="0" w:color="999999"/>
+              <w:right w:val="single" w:sz="4" w:space="0" w:color="999999"/>
+            </w:tcBorders>
+            <w:tcMar>
+              <w:top w:w="80" w:type="dxa"/>
+              <w:left w:w="100" w:type="dxa"/>
+              <w:bottom w:w="80" w:type="dxa"/>
+              <w:right w:w="100" w:type="dxa"/>
+            </w:tcMar>
+          </w:tcPr>
+          <w:p>
+            <w:pPr>
+              <w:spacing w:after="60"/>
+            </w:pPr>
+            <w:r>
+              <w:rPr>
+                <w:rFonts w:ascii="Times New Roman" w:hAnsi="Times New Roman"/>
+                <w:b w:val="0"/>
+                <w:sz w:val="20"/>
+              </w:rPr>
+              <w:t>pending | verified | suspended.</w:t>
+            </w:r>
+          </w:p>
+        </w:tc>
+      </w:tr>
+      <w:tr>
+        <w:trPr>
+          <w:cantSplit/>
+        </w:trPr>
+        <w:tc>
+          <w:tcPr>
+            <w:tcW w:w="2203" w:type="dxa"/>
+            <w:tcBorders>
+              <w:top w:val="single" w:sz="4" w:space="0" w:color="999999"/>
+              <w:left w:val="single" w:sz="4" w:space="0" w:color="999999"/>
+              <w:bottom w:val="single" w:sz="4" w:space="0" w:color="999999"/>
+              <w:right w:val="single" w:sz="4" w:space="0" w:color="999999"/>
+            </w:tcBorders>
+            <w:tcMar>
+              <w:top w:w="80" w:type="dxa"/>
+              <w:left w:w="100" w:type="dxa"/>
+              <w:bottom w:w="80" w:type="dxa"/>
+              <w:right w:w="100" w:type="dxa"/>
+            </w:tcMar>
+          </w:tcPr>
+          <w:p>
+            <w:pPr>
+              <w:spacing w:after="60"/>
+            </w:pPr>
+            <w:r>
+              <w:rPr>
+                <w:rFonts w:ascii="Times New Roman" w:hAnsi="Times New Roman"/>
+                <w:b w:val="0"/>
+                <w:sz w:val="20"/>
+              </w:rPr>
+              <w:t>verified_by (FK, nullable)</w:t>
+            </w:r>
+          </w:p>
+        </w:tc>
+        <w:tc>
+          <w:tcPr>
+            <w:tcW w:w="2203" w:type="dxa"/>
+            <w:tcBorders>
+              <w:top w:val="single" w:sz="4" w:space="0" w:color="999999"/>
+              <w:left w:val="single" w:sz="4" w:space="0" w:color="999999"/>
+              <w:bottom w:val="single" w:sz="4" w:space="0" w:color="999999"/>
+              <w:right w:val="single" w:sz="4" w:space="0" w:color="999999"/>
+            </w:tcBorders>
+            <w:tcMar>
+              <w:top w:w="80" w:type="dxa"/>
+              <w:left w:w="100" w:type="dxa"/>
+              <w:bottom w:w="80" w:type="dxa"/>
+              <w:right w:w="100" w:type="dxa"/>
+            </w:tcMar>
+          </w:tcPr>
+          <w:p>
+            <w:pPr>
+              <w:spacing w:after="60"/>
+            </w:pPr>
+            <w:r>
+              <w:rPr>
+                <w:rFonts w:ascii="Times New Roman" w:hAnsi="Times New Roman"/>
+                <w:b w:val="0"/>
+                <w:sz w:val="20"/>
+              </w:rPr>
+              <w:t>Id</w:t>
+            </w:r>
+          </w:p>
+        </w:tc>
+        <w:tc>
+          <w:tcPr>
+            <w:tcW w:w="5198" w:type="dxa"/>
+            <w:tcBorders>
+              <w:top w:val="single" w:sz="4" w:space="0" w:color="999999"/>
+              <w:left w:val="single" w:sz="4" w:space="0" w:color="999999"/>
+              <w:bottom w:val="single" w:sz="4" w:space="0" w:color="999999"/>
+              <w:right w:val="single" w:sz="4" w:space="0" w:color="999999"/>
+            </w:tcBorders>
+            <w:tcMar>
+              <w:top w:w="80" w:type="dxa"/>
+              <w:left w:w="100" w:type="dxa"/>
+              <w:bottom w:w="80" w:type="dxa"/>
+              <w:right w:w="100" w:type="dxa"/>
+            </w:tcMar>
+          </w:tcPr>
+          <w:p>
+            <w:pPr>
+              <w:spacing w:after="60"/>
+            </w:pPr>
+            <w:r>
+              <w:rPr>
+                <w:rFonts w:ascii="Times New Roman" w:hAnsi="Times New Roman"/>
+                <w:b w:val="0"/>
+                <w:sz w:val="20"/>
+              </w:rPr>
+              <w:t>Admin pemverifikasi; NULL sebelum verifikasi.</w:t>
+            </w:r>
+          </w:p>
+        </w:tc>
+      </w:tr>
+      <w:tr>
+        <w:trPr>
+          <w:cantSplit/>
+        </w:trPr>
+        <w:tc>
+          <w:tcPr>
+            <w:tcW w:w="2203" w:type="dxa"/>
+            <w:tcBorders>
+              <w:top w:val="single" w:sz="4" w:space="0" w:color="999999"/>
+              <w:left w:val="single" w:sz="4" w:space="0" w:color="999999"/>
+              <w:bottom w:val="single" w:sz="4" w:space="0" w:color="999999"/>
+              <w:right w:val="single" w:sz="4" w:space="0" w:color="999999"/>
+            </w:tcBorders>
+            <w:tcMar>
+              <w:top w:w="80" w:type="dxa"/>
+              <w:left w:w="100" w:type="dxa"/>
+              <w:bottom w:w="80" w:type="dxa"/>
+              <w:right w:w="100" w:type="dxa"/>
+            </w:tcMar>
+          </w:tcPr>
+          <w:p>
+            <w:pPr>
+              <w:spacing w:after="60"/>
+            </w:pPr>
+            <w:r>
+              <w:rPr>
+                <w:rFonts w:ascii="Times New Roman" w:hAnsi="Times New Roman"/>
+                <w:b w:val="0"/>
+                <w:sz w:val="20"/>
+              </w:rPr>
+              <w:t>verified_at (nullable)</w:t>
+            </w:r>
+          </w:p>
+        </w:tc>
+        <w:tc>
+          <w:tcPr>
+            <w:tcW w:w="2203" w:type="dxa"/>
+            <w:tcBorders>
+              <w:top w:val="single" w:sz="4" w:space="0" w:color="999999"/>
+              <w:left w:val="single" w:sz="4" w:space="0" w:color="999999"/>
+              <w:bottom w:val="single" w:sz="4" w:space="0" w:color="999999"/>
+              <w:right w:val="single" w:sz="4" w:space="0" w:color="999999"/>
+            </w:tcBorders>
+            <w:tcMar>
+              <w:top w:w="80" w:type="dxa"/>
+              <w:left w:w="100" w:type="dxa"/>
+              <w:bottom w:w="80" w:type="dxa"/>
+              <w:right w:w="100" w:type="dxa"/>
+            </w:tcMar>
+          </w:tcPr>
+          <w:p>
+            <w:pPr>
+              <w:spacing w:after="60"/>
+            </w:pPr>
+            <w:r>
+              <w:rPr>
+                <w:rFonts w:ascii="Times New Roman" w:hAnsi="Times New Roman"/>
+                <w:b w:val="0"/>
+                <w:sz w:val="20"/>
+              </w:rPr>
               <w:t>TIMESTAMP</w:t>
             </w:r>
           </w:p>
         </w:tc>
         <w:tc>
           <w:tcPr>
-            <w:tcW w:w="5200" w:type="dxa"/>
-            <w:tcBorders>
-              <w:top w:val="single" w:sz="4" w:space="0" w:color="999999"/>
-              <w:left w:val="single" w:sz="4" w:space="0" w:color="999999"/>
-              <w:bottom w:val="single" w:sz="4" w:space="0" w:color="999999"/>
-              <w:right w:val="single" w:sz="4" w:space="0" w:color="999999"/>
-            </w:tcBorders>
-            <w:tcMar>
-              <w:top w:w="80" w:type="dxa"/>
-              <w:left w:w="100" w:type="dxa"/>
-              <w:bottom w:w="80" w:type="dxa"/>
-              <w:right w:w="100" w:type="dxa"/>
-            </w:tcMar>
-          </w:tcPr>
-          <w:p>
-            <w:pPr>
-              <w:jc w:val="both"/>
-            </w:pPr>
-            <w:r>
-              <w:t xml:space="preserve">Waktu </w:t>
-            </w:r>
-            <w:proofErr w:type="spellStart"/>
-            <w:r>
-              <w:t>terakhir</w:t>
-            </w:r>
-            <w:proofErr w:type="spellEnd"/>
-            <w:r>
-              <w:t xml:space="preserve"> data event </w:t>
-            </w:r>
-            <w:proofErr w:type="spellStart"/>
-            <w:r>
-              <w:t>diperbarui</w:t>
-            </w:r>
-            <w:proofErr w:type="spellEnd"/>
-            <w:r>
-              <w:t xml:space="preserve">, </w:t>
-            </w:r>
-            <w:proofErr w:type="spellStart"/>
-            <w:r>
-              <w:t>termasuk</w:t>
-            </w:r>
-            <w:proofErr w:type="spellEnd"/>
-            <w:r>
-              <w:t xml:space="preserve"> </w:t>
-            </w:r>
-            <w:proofErr w:type="spellStart"/>
-            <w:r>
-              <w:t>saat</w:t>
-            </w:r>
-            <w:proofErr w:type="spellEnd"/>
-            <w:r>
-              <w:t xml:space="preserve"> status </w:t>
-            </w:r>
-            <w:proofErr w:type="spellStart"/>
-            <w:r>
-              <w:t>berubah</w:t>
-            </w:r>
-            <w:proofErr w:type="spellEnd"/>
-            <w:r>
-              <w:t>.</w:t>
+            <w:tcW w:w="5198" w:type="dxa"/>
+            <w:tcBorders>
+              <w:top w:val="single" w:sz="4" w:space="0" w:color="999999"/>
+              <w:left w:val="single" w:sz="4" w:space="0" w:color="999999"/>
+              <w:bottom w:val="single" w:sz="4" w:space="0" w:color="999999"/>
+              <w:right w:val="single" w:sz="4" w:space="0" w:color="999999"/>
+            </w:tcBorders>
+            <w:tcMar>
+              <w:top w:w="80" w:type="dxa"/>
+              <w:left w:w="100" w:type="dxa"/>
+              <w:bottom w:w="80" w:type="dxa"/>
+              <w:right w:w="100" w:type="dxa"/>
+            </w:tcMar>
+          </w:tcPr>
+          <w:p>
+            <w:pPr>
+              <w:spacing w:after="60"/>
+            </w:pPr>
+            <w:r>
+              <w:rPr>
+                <w:rFonts w:ascii="Times New Roman" w:hAnsi="Times New Roman"/>
+                <w:b w:val="0"/>
+                <w:sz w:val="20"/>
+              </w:rPr>
+              <w:t>Waktu verifikasi.</w:t>
             </w:r>
           </w:p>
         </w:tc>
@@ -4919,6 +5261,7 @@
     <w:p>
       <w:pPr>
         <w:pStyle w:val="Judul1"/>
+        <w:keepNext/>
         <w:spacing w:before="320" w:after="150"/>
         <w:jc w:val="both"/>
         <w:rPr>
@@ -5024,6 +5367,8 @@
         </w:tblPrEx>
         <w:trPr>
           <w:tblHeader/>
+          <w:cantSplit/>
+          <w:tblHeader/>
         </w:trPr>
         <w:tc>
           <w:tcPr>
@@ -5163,6 +5508,9 @@
             <w:bottom w:w="0" w:type="dxa"/>
           </w:tblCellMar>
         </w:tblPrEx>
+        <w:trPr>
+          <w:cantSplit/>
+        </w:trPr>
         <w:tc>
           <w:tcPr>
             <w:tcW w:w="2600" w:type="dxa"/>
@@ -5181,26 +5529,14 @@
           </w:tcPr>
           <w:p>
             <w:pPr>
-              <w:jc w:val="both"/>
-            </w:pPr>
-            <w:r>
-              <w:t>User (</w:t>
-            </w:r>
-            <w:proofErr w:type="spellStart"/>
-            <w:r>
-              <w:t>penyelenggara</w:t>
-            </w:r>
-            <w:proofErr w:type="spellEnd"/>
-            <w:r>
-              <w:t xml:space="preserve">) </w:t>
-            </w:r>
-            <w:proofErr w:type="spellStart"/>
-            <w:r>
-              <w:t>mengajukan</w:t>
-            </w:r>
-            <w:proofErr w:type="spellEnd"/>
-            <w:r>
-              <w:t xml:space="preserve"> Event</w:t>
+              <w:spacing w:after="60"/>
+            </w:pPr>
+            <w:r>
+              <w:rPr>
+                <w:rFonts w:ascii="Times New Roman" w:hAnsi="Times New Roman"/>
+                <w:sz w:val="20"/>
+              </w:rPr>
+              <w:t>Organization memiliki User</w:t>
             </w:r>
           </w:p>
         </w:tc>
@@ -5222,15 +5558,14 @@
           </w:tcPr>
           <w:p>
             <w:pPr>
-              <w:jc w:val="both"/>
-            </w:pPr>
-            <w:proofErr w:type="gramStart"/>
-            <w:r>
-              <w:t>1 :</w:t>
-            </w:r>
-            <w:proofErr w:type="gramEnd"/>
-            <w:r>
-              <w:t xml:space="preserve"> N</w:t>
+              <w:spacing w:after="60"/>
+            </w:pPr>
+            <w:r>
+              <w:rPr>
+                <w:rFonts w:ascii="Times New Roman" w:hAnsi="Times New Roman"/>
+                <w:sz w:val="20"/>
+              </w:rPr>
+              <w:t>1 : 0..N</w:t>
             </w:r>
           </w:p>
         </w:tc>
@@ -5252,10 +5587,14 @@
           </w:tcPr>
           <w:p>
             <w:pPr>
-              <w:jc w:val="both"/>
-            </w:pPr>
-            <w:r>
-              <w:t>Wajib (mandatory)</w:t>
+              <w:spacing w:after="60"/>
+            </w:pPr>
+            <w:r>
+              <w:rPr>
+                <w:rFonts w:ascii="Times New Roman" w:hAnsi="Times New Roman"/>
+                <w:sz w:val="20"/>
+              </w:rPr>
+              <w:t>FK opsional menurut peran</w:t>
             </w:r>
           </w:p>
         </w:tc>
@@ -5277,90 +5616,14 @@
           </w:tcPr>
           <w:p>
             <w:pPr>
-              <w:jc w:val="both"/>
-            </w:pPr>
-            <w:r>
-              <w:t xml:space="preserve">Satu </w:t>
-            </w:r>
-            <w:proofErr w:type="spellStart"/>
-            <w:r>
-              <w:t>pengguna</w:t>
-            </w:r>
-            <w:proofErr w:type="spellEnd"/>
-            <w:r>
-              <w:t xml:space="preserve"> </w:t>
-            </w:r>
-            <w:proofErr w:type="spellStart"/>
-            <w:r>
-              <w:t>penyelenggara</w:t>
-            </w:r>
-            <w:proofErr w:type="spellEnd"/>
-            <w:r>
-              <w:t xml:space="preserve"> </w:t>
-            </w:r>
-            <w:proofErr w:type="spellStart"/>
-            <w:r>
-              <w:t>dapat</w:t>
-            </w:r>
-            <w:proofErr w:type="spellEnd"/>
-            <w:r>
-              <w:t xml:space="preserve"> </w:t>
-            </w:r>
-            <w:proofErr w:type="spellStart"/>
-            <w:r>
-              <w:t>mengajukan</w:t>
-            </w:r>
-            <w:proofErr w:type="spellEnd"/>
-            <w:r>
-              <w:t xml:space="preserve"> </w:t>
-            </w:r>
-            <w:proofErr w:type="spellStart"/>
-            <w:r>
-              <w:t>banyak</w:t>
-            </w:r>
-            <w:proofErr w:type="spellEnd"/>
-            <w:r>
-              <w:t xml:space="preserve"> event; </w:t>
-            </w:r>
-            <w:proofErr w:type="spellStart"/>
-            <w:r>
-              <w:t>setiap</w:t>
-            </w:r>
-            <w:proofErr w:type="spellEnd"/>
-            <w:r>
-              <w:t xml:space="preserve"> event </w:t>
-            </w:r>
-            <w:proofErr w:type="spellStart"/>
-            <w:r>
-              <w:t>wajib</w:t>
-            </w:r>
-            <w:proofErr w:type="spellEnd"/>
-            <w:r>
-              <w:t xml:space="preserve"> </w:t>
-            </w:r>
-            <w:proofErr w:type="spellStart"/>
-            <w:r>
-              <w:t>memiliki</w:t>
-            </w:r>
-            <w:proofErr w:type="spellEnd"/>
-            <w:r>
-              <w:t xml:space="preserve"> </w:t>
-            </w:r>
-            <w:proofErr w:type="spellStart"/>
-            <w:r>
-              <w:t>satu</w:t>
-            </w:r>
-            <w:proofErr w:type="spellEnd"/>
-            <w:r>
-              <w:t xml:space="preserve"> </w:t>
-            </w:r>
-            <w:proofErr w:type="spellStart"/>
-            <w:r>
-              <w:t>organizer_id</w:t>
-            </w:r>
-            <w:proofErr w:type="spellEnd"/>
-            <w:r>
-              <w:t xml:space="preserve"> (US-EVENT-01).</w:t>
+              <w:spacing w:after="60"/>
+            </w:pPr>
+            <w:r>
+              <w:rPr>
+                <w:rFonts w:ascii="Times New Roman" w:hAnsi="Times New Roman"/>
+                <w:sz w:val="20"/>
+              </w:rPr>
+              <w:t>Penyelenggara wajib terkait satu organisasi; mahasiswa/admin dapat tanpa organisasi.</w:t>
             </w:r>
           </w:p>
         </w:tc>
@@ -5372,6 +5635,9 @@
             <w:bottom w:w="0" w:type="dxa"/>
           </w:tblCellMar>
         </w:tblPrEx>
+        <w:trPr>
+          <w:cantSplit/>
+        </w:trPr>
         <w:tc>
           <w:tcPr>
             <w:tcW w:w="2600" w:type="dxa"/>
@@ -5390,18 +5656,14 @@
           </w:tcPr>
           <w:p>
             <w:pPr>
-              <w:jc w:val="both"/>
-            </w:pPr>
-            <w:r>
-              <w:t xml:space="preserve">User (admin) </w:t>
-            </w:r>
-            <w:proofErr w:type="spellStart"/>
-            <w:r>
-              <w:t>memoderasi</w:t>
-            </w:r>
-            <w:proofErr w:type="spellEnd"/>
-            <w:r>
-              <w:t xml:space="preserve"> Event</w:t>
+              <w:spacing w:after="60"/>
+            </w:pPr>
+            <w:r>
+              <w:rPr>
+                <w:rFonts w:ascii="Times New Roman" w:hAnsi="Times New Roman"/>
+                <w:sz w:val="20"/>
+              </w:rPr>
+              <w:t>Organization memiliki Event</w:t>
             </w:r>
           </w:p>
         </w:tc>
@@ -5423,15 +5685,14 @@
           </w:tcPr>
           <w:p>
             <w:pPr>
-              <w:jc w:val="both"/>
-            </w:pPr>
-            <w:proofErr w:type="gramStart"/>
-            <w:r>
-              <w:t>1 :</w:t>
-            </w:r>
-            <w:proofErr w:type="gramEnd"/>
-            <w:r>
-              <w:t xml:space="preserve"> N</w:t>
+              <w:spacing w:after="60"/>
+            </w:pPr>
+            <w:r>
+              <w:rPr>
+                <w:rFonts w:ascii="Times New Roman" w:hAnsi="Times New Roman"/>
+                <w:sz w:val="20"/>
+              </w:rPr>
+              <w:t>1 : 0..N</w:t>
             </w:r>
           </w:p>
         </w:tc>
@@ -5453,15 +5714,14 @@
           </w:tcPr>
           <w:p>
             <w:pPr>
-              <w:jc w:val="both"/>
-            </w:pPr>
-            <w:proofErr w:type="spellStart"/>
-            <w:r>
-              <w:t>Opsional</w:t>
-            </w:r>
-            <w:proofErr w:type="spellEnd"/>
-            <w:r>
-              <w:t xml:space="preserve"> (optional)</w:t>
+              <w:spacing w:after="60"/>
+            </w:pPr>
+            <w:r>
+              <w:rPr>
+                <w:rFonts w:ascii="Times New Roman" w:hAnsi="Times New Roman"/>
+                <w:sz w:val="20"/>
+              </w:rPr>
+              <w:t>Wajib</w:t>
             </w:r>
           </w:p>
         </w:tc>
@@ -5483,66 +5743,14 @@
           </w:tcPr>
           <w:p>
             <w:pPr>
-              <w:jc w:val="both"/>
-            </w:pPr>
-            <w:r>
-              <w:t xml:space="preserve">Satu admin </w:t>
-            </w:r>
-            <w:proofErr w:type="spellStart"/>
-            <w:r>
-              <w:t>dapat</w:t>
-            </w:r>
-            <w:proofErr w:type="spellEnd"/>
-            <w:r>
-              <w:t xml:space="preserve"> </w:t>
-            </w:r>
-            <w:proofErr w:type="spellStart"/>
-            <w:r>
-              <w:t>memoderasi</w:t>
-            </w:r>
-            <w:proofErr w:type="spellEnd"/>
-            <w:r>
-              <w:t xml:space="preserve"> </w:t>
-            </w:r>
-            <w:proofErr w:type="spellStart"/>
-            <w:r>
-              <w:t>banyak</w:t>
-            </w:r>
-            <w:proofErr w:type="spellEnd"/>
-            <w:r>
-              <w:t xml:space="preserve"> event; </w:t>
-            </w:r>
-            <w:proofErr w:type="spellStart"/>
-            <w:r>
-              <w:t>moderated_by</w:t>
-            </w:r>
-            <w:proofErr w:type="spellEnd"/>
-            <w:r>
-              <w:t xml:space="preserve"> </w:t>
-            </w:r>
-            <w:proofErr w:type="spellStart"/>
-            <w:r>
-              <w:t>kosong</w:t>
-            </w:r>
-            <w:proofErr w:type="spellEnd"/>
-            <w:r>
-              <w:t xml:space="preserve"> </w:t>
-            </w:r>
-            <w:proofErr w:type="spellStart"/>
-            <w:r>
-              <w:t>sebelum</w:t>
-            </w:r>
-            <w:proofErr w:type="spellEnd"/>
-            <w:r>
-              <w:t xml:space="preserve"> event </w:t>
-            </w:r>
-            <w:proofErr w:type="spellStart"/>
-            <w:r>
-              <w:t>diproses</w:t>
-            </w:r>
-            <w:proofErr w:type="spellEnd"/>
-            <w:r>
-              <w:t xml:space="preserve"> (US-EVENT-02).</w:t>
+              <w:spacing w:after="60"/>
+            </w:pPr>
+            <w:r>
+              <w:rPr>
+                <w:rFonts w:ascii="Times New Roman" w:hAnsi="Times New Roman"/>
+                <w:sz w:val="20"/>
+              </w:rPr>
+              <w:t>Setiap event milik satu organisasi; hanya organisasi verified dapat mengajukan.</w:t>
             </w:r>
           </w:p>
         </w:tc>
@@ -5554,6 +5762,9 @@
             <w:bottom w:w="0" w:type="dxa"/>
           </w:tblCellMar>
         </w:tblPrEx>
+        <w:trPr>
+          <w:cantSplit/>
+        </w:trPr>
         <w:tc>
           <w:tcPr>
             <w:tcW w:w="2600" w:type="dxa"/>
@@ -5572,23 +5783,14 @@
           </w:tcPr>
           <w:p>
             <w:pPr>
-              <w:jc w:val="both"/>
-            </w:pPr>
-            <w:proofErr w:type="spellStart"/>
-            <w:r>
-              <w:t>EventCategory</w:t>
-            </w:r>
-            <w:proofErr w:type="spellEnd"/>
-            <w:r>
-              <w:t xml:space="preserve"> </w:t>
-            </w:r>
-            <w:proofErr w:type="spellStart"/>
-            <w:r>
-              <w:t>mengklasifikasikan</w:t>
-            </w:r>
-            <w:proofErr w:type="spellEnd"/>
-            <w:r>
-              <w:t xml:space="preserve"> Event</w:t>
+              <w:spacing w:after="60"/>
+            </w:pPr>
+            <w:r>
+              <w:rPr>
+                <w:rFonts w:ascii="Times New Roman" w:hAnsi="Times New Roman"/>
+                <w:sz w:val="20"/>
+              </w:rPr>
+              <w:t>User membuat Event</w:t>
             </w:r>
           </w:p>
         </w:tc>
@@ -5610,15 +5812,14 @@
           </w:tcPr>
           <w:p>
             <w:pPr>
-              <w:jc w:val="both"/>
-            </w:pPr>
-            <w:proofErr w:type="gramStart"/>
-            <w:r>
-              <w:t>1 :</w:t>
-            </w:r>
-            <w:proofErr w:type="gramEnd"/>
-            <w:r>
-              <w:t xml:space="preserve"> N</w:t>
+              <w:spacing w:after="60"/>
+            </w:pPr>
+            <w:r>
+              <w:rPr>
+                <w:rFonts w:ascii="Times New Roman" w:hAnsi="Times New Roman"/>
+                <w:sz w:val="20"/>
+              </w:rPr>
+              <w:t>1 : 0..N</w:t>
             </w:r>
           </w:p>
         </w:tc>
@@ -5640,10 +5841,14 @@
           </w:tcPr>
           <w:p>
             <w:pPr>
-              <w:jc w:val="both"/>
-            </w:pPr>
-            <w:r>
-              <w:t>Wajib (mandatory)</w:t>
+              <w:spacing w:after="60"/>
+            </w:pPr>
+            <w:r>
+              <w:rPr>
+                <w:rFonts w:ascii="Times New Roman" w:hAnsi="Times New Roman"/>
+                <w:sz w:val="20"/>
+              </w:rPr>
+              <w:t>Wajib</w:t>
             </w:r>
           </w:p>
         </w:tc>
@@ -5665,82 +5870,268 @@
           </w:tcPr>
           <w:p>
             <w:pPr>
-              <w:jc w:val="both"/>
-            </w:pPr>
-            <w:r>
-              <w:t xml:space="preserve">Satu </w:t>
-            </w:r>
-            <w:proofErr w:type="spellStart"/>
-            <w:r>
-              <w:t>kategori</w:t>
-            </w:r>
-            <w:proofErr w:type="spellEnd"/>
-            <w:r>
-              <w:t xml:space="preserve"> </w:t>
-            </w:r>
-            <w:proofErr w:type="spellStart"/>
-            <w:r>
-              <w:t>dapat</w:t>
-            </w:r>
-            <w:proofErr w:type="spellEnd"/>
-            <w:r>
-              <w:t xml:space="preserve"> </w:t>
-            </w:r>
-            <w:proofErr w:type="spellStart"/>
-            <w:r>
-              <w:t>menaungi</w:t>
-            </w:r>
-            <w:proofErr w:type="spellEnd"/>
-            <w:r>
-              <w:t xml:space="preserve"> </w:t>
-            </w:r>
-            <w:proofErr w:type="spellStart"/>
-            <w:r>
-              <w:t>banyak</w:t>
-            </w:r>
-            <w:proofErr w:type="spellEnd"/>
-            <w:r>
-              <w:t xml:space="preserve"> event; </w:t>
-            </w:r>
-            <w:proofErr w:type="spellStart"/>
-            <w:r>
-              <w:t>setiap</w:t>
-            </w:r>
-            <w:proofErr w:type="spellEnd"/>
-            <w:r>
-              <w:t xml:space="preserve"> event </w:t>
-            </w:r>
-            <w:proofErr w:type="spellStart"/>
-            <w:r>
-              <w:t>wajib</w:t>
-            </w:r>
-            <w:proofErr w:type="spellEnd"/>
-            <w:r>
-              <w:t xml:space="preserve"> </w:t>
-            </w:r>
-            <w:proofErr w:type="spellStart"/>
-            <w:r>
-              <w:t>memiliki</w:t>
-            </w:r>
-            <w:proofErr w:type="spellEnd"/>
-            <w:r>
-              <w:t xml:space="preserve"> </w:t>
-            </w:r>
-            <w:proofErr w:type="spellStart"/>
-            <w:r>
-              <w:t>satu</w:t>
-            </w:r>
-            <w:proofErr w:type="spellEnd"/>
-            <w:r>
-              <w:t xml:space="preserve"> </w:t>
-            </w:r>
-            <w:proofErr w:type="spellStart"/>
-            <w:r>
-              <w:t>category_id</w:t>
-            </w:r>
-            <w:proofErr w:type="spellEnd"/>
-            <w:r>
-              <w:t xml:space="preserve"> (US-EVENT-05).</w:t>
+              <w:spacing w:after="60"/>
+            </w:pPr>
+            <w:r>
+              <w:rPr>
+                <w:rFonts w:ascii="Times New Roman" w:hAnsi="Times New Roman"/>
+                <w:sz w:val="20"/>
+              </w:rPr>
+              <w:t>Pembuat berperan penyelenggara dari organisasi pemilik.</w:t>
+            </w:r>
+          </w:p>
+        </w:tc>
+      </w:tr>
+      <w:tr>
+        <w:tblPrEx>
+          <w:tblCellMar>
+            <w:top w:w="0" w:type="dxa"/>
+            <w:bottom w:w="0" w:type="dxa"/>
+          </w:tblCellMar>
+        </w:tblPrEx>
+        <w:trPr>
+          <w:cantSplit/>
+        </w:trPr>
+        <w:tc>
+          <w:tcPr>
+            <w:tcW w:w="2600" w:type="dxa"/>
+            <w:tcBorders>
+              <w:top w:val="single" w:sz="4" w:space="0" w:color="999999"/>
+              <w:left w:val="single" w:sz="4" w:space="0" w:color="999999"/>
+              <w:bottom w:val="single" w:sz="4" w:space="0" w:color="999999"/>
+              <w:right w:val="single" w:sz="4" w:space="0" w:color="999999"/>
+            </w:tcBorders>
+            <w:tcMar>
+              <w:top w:w="80" w:type="dxa"/>
+              <w:left w:w="100" w:type="dxa"/>
+              <w:bottom w:w="80" w:type="dxa"/>
+              <w:right w:w="100" w:type="dxa"/>
+            </w:tcMar>
+          </w:tcPr>
+          <w:p>
+            <w:pPr>
+              <w:spacing w:after="60"/>
+            </w:pPr>
+            <w:r>
+              <w:rPr>
+                <w:rFonts w:ascii="Times New Roman" w:hAnsi="Times New Roman"/>
+                <w:sz w:val="20"/>
+              </w:rPr>
+              <w:t>User memoderasi Event</w:t>
+            </w:r>
+          </w:p>
+        </w:tc>
+        <w:tc>
+          <w:tcPr>
+            <w:tcW w:w="1400" w:type="dxa"/>
+            <w:tcBorders>
+              <w:top w:val="single" w:sz="4" w:space="0" w:color="999999"/>
+              <w:left w:val="single" w:sz="4" w:space="0" w:color="999999"/>
+              <w:bottom w:val="single" w:sz="4" w:space="0" w:color="999999"/>
+              <w:right w:val="single" w:sz="4" w:space="0" w:color="999999"/>
+            </w:tcBorders>
+            <w:tcMar>
+              <w:top w:w="80" w:type="dxa"/>
+              <w:left w:w="100" w:type="dxa"/>
+              <w:bottom w:w="80" w:type="dxa"/>
+              <w:right w:w="100" w:type="dxa"/>
+            </w:tcMar>
+          </w:tcPr>
+          <w:p>
+            <w:pPr>
+              <w:spacing w:after="60"/>
+            </w:pPr>
+            <w:r>
+              <w:rPr>
+                <w:rFonts w:ascii="Times New Roman" w:hAnsi="Times New Roman"/>
+                <w:sz w:val="20"/>
+              </w:rPr>
+              <w:t>0..1 : 0..N</w:t>
+            </w:r>
+          </w:p>
+        </w:tc>
+        <w:tc>
+          <w:tcPr>
+            <w:tcW w:w="2600" w:type="dxa"/>
+            <w:tcBorders>
+              <w:top w:val="single" w:sz="4" w:space="0" w:color="999999"/>
+              <w:left w:val="single" w:sz="4" w:space="0" w:color="999999"/>
+              <w:bottom w:val="single" w:sz="4" w:space="0" w:color="999999"/>
+              <w:right w:val="single" w:sz="4" w:space="0" w:color="999999"/>
+            </w:tcBorders>
+            <w:tcMar>
+              <w:top w:w="80" w:type="dxa"/>
+              <w:left w:w="100" w:type="dxa"/>
+              <w:bottom w:w="80" w:type="dxa"/>
+              <w:right w:w="100" w:type="dxa"/>
+            </w:tcMar>
+          </w:tcPr>
+          <w:p>
+            <w:pPr>
+              <w:spacing w:after="60"/>
+            </w:pPr>
+            <w:r>
+              <w:rPr>
+                <w:rFonts w:ascii="Times New Roman" w:hAnsi="Times New Roman"/>
+                <w:sz w:val="20"/>
+              </w:rPr>
+              <w:t>Opsional</w:t>
+            </w:r>
+          </w:p>
+        </w:tc>
+        <w:tc>
+          <w:tcPr>
+            <w:tcW w:w="2600" w:type="dxa"/>
+            <w:tcBorders>
+              <w:top w:val="single" w:sz="4" w:space="0" w:color="999999"/>
+              <w:left w:val="single" w:sz="4" w:space="0" w:color="999999"/>
+              <w:bottom w:val="single" w:sz="4" w:space="0" w:color="999999"/>
+              <w:right w:val="single" w:sz="4" w:space="0" w:color="999999"/>
+            </w:tcBorders>
+            <w:tcMar>
+              <w:top w:w="80" w:type="dxa"/>
+              <w:left w:w="100" w:type="dxa"/>
+              <w:bottom w:w="80" w:type="dxa"/>
+              <w:right w:w="100" w:type="dxa"/>
+            </w:tcMar>
+          </w:tcPr>
+          <w:p>
+            <w:pPr>
+              <w:spacing w:after="60"/>
+            </w:pPr>
+            <w:r>
+              <w:rPr>
+                <w:rFonts w:ascii="Times New Roman" w:hAnsi="Times New Roman"/>
+                <w:sz w:val="20"/>
+              </w:rPr>
+              <w:t>moderated_by adalah admin; kosong sebelum keputusan.</w:t>
+            </w:r>
+          </w:p>
+        </w:tc>
+      </w:tr>
+      <w:tr>
+        <w:tblPrEx>
+          <w:tblCellMar>
+            <w:top w:w="0" w:type="dxa"/>
+            <w:bottom w:w="0" w:type="dxa"/>
+          </w:tblCellMar>
+        </w:tblPrEx>
+        <w:trPr>
+          <w:cantSplit/>
+        </w:trPr>
+        <w:tc>
+          <w:tcPr>
+            <w:tcW w:w="2600" w:type="dxa"/>
+            <w:tcBorders>
+              <w:top w:val="single" w:sz="4" w:space="0" w:color="999999"/>
+              <w:left w:val="single" w:sz="4" w:space="0" w:color="999999"/>
+              <w:bottom w:val="single" w:sz="4" w:space="0" w:color="999999"/>
+              <w:right w:val="single" w:sz="4" w:space="0" w:color="999999"/>
+            </w:tcBorders>
+            <w:tcMar>
+              <w:top w:w="80" w:type="dxa"/>
+              <w:left w:w="100" w:type="dxa"/>
+              <w:bottom w:w="80" w:type="dxa"/>
+              <w:right w:w="100" w:type="dxa"/>
+            </w:tcMar>
+          </w:tcPr>
+          <w:p>
+            <w:pPr>
+              <w:spacing w:after="60"/>
+            </w:pPr>
+            <w:r>
+              <w:rPr>
+                <w:rFonts w:ascii="Times New Roman" w:hAnsi="Times New Roman"/>
+                <w:sz w:val="20"/>
+              </w:rPr>
+              <w:t>EventCategory mengklasifikasikan Event</w:t>
+            </w:r>
+          </w:p>
+        </w:tc>
+        <w:tc>
+          <w:tcPr>
+            <w:tcW w:w="1400" w:type="dxa"/>
+            <w:tcBorders>
+              <w:top w:val="single" w:sz="4" w:space="0" w:color="999999"/>
+              <w:left w:val="single" w:sz="4" w:space="0" w:color="999999"/>
+              <w:bottom w:val="single" w:sz="4" w:space="0" w:color="999999"/>
+              <w:right w:val="single" w:sz="4" w:space="0" w:color="999999"/>
+            </w:tcBorders>
+            <w:tcMar>
+              <w:top w:w="80" w:type="dxa"/>
+              <w:left w:w="100" w:type="dxa"/>
+              <w:bottom w:w="80" w:type="dxa"/>
+              <w:right w:w="100" w:type="dxa"/>
+            </w:tcMar>
+          </w:tcPr>
+          <w:p>
+            <w:pPr>
+              <w:spacing w:after="60"/>
+            </w:pPr>
+            <w:r>
+              <w:rPr>
+                <w:rFonts w:ascii="Times New Roman" w:hAnsi="Times New Roman"/>
+                <w:sz w:val="20"/>
+              </w:rPr>
+              <w:t>1 : 0..N</w:t>
+            </w:r>
+          </w:p>
+        </w:tc>
+        <w:tc>
+          <w:tcPr>
+            <w:tcW w:w="2600" w:type="dxa"/>
+            <w:tcBorders>
+              <w:top w:val="single" w:sz="4" w:space="0" w:color="999999"/>
+              <w:left w:val="single" w:sz="4" w:space="0" w:color="999999"/>
+              <w:bottom w:val="single" w:sz="4" w:space="0" w:color="999999"/>
+              <w:right w:val="single" w:sz="4" w:space="0" w:color="999999"/>
+            </w:tcBorders>
+            <w:tcMar>
+              <w:top w:w="80" w:type="dxa"/>
+              <w:left w:w="100" w:type="dxa"/>
+              <w:bottom w:w="80" w:type="dxa"/>
+              <w:right w:w="100" w:type="dxa"/>
+            </w:tcMar>
+          </w:tcPr>
+          <w:p>
+            <w:pPr>
+              <w:spacing w:after="60"/>
+            </w:pPr>
+            <w:r>
+              <w:rPr>
+                <w:rFonts w:ascii="Times New Roman" w:hAnsi="Times New Roman"/>
+                <w:sz w:val="20"/>
+              </w:rPr>
+              <w:t>Wajib</w:t>
+            </w:r>
+          </w:p>
+        </w:tc>
+        <w:tc>
+          <w:tcPr>
+            <w:tcW w:w="2600" w:type="dxa"/>
+            <w:tcBorders>
+              <w:top w:val="single" w:sz="4" w:space="0" w:color="999999"/>
+              <w:left w:val="single" w:sz="4" w:space="0" w:color="999999"/>
+              <w:bottom w:val="single" w:sz="4" w:space="0" w:color="999999"/>
+              <w:right w:val="single" w:sz="4" w:space="0" w:color="999999"/>
+            </w:tcBorders>
+            <w:tcMar>
+              <w:top w:w="80" w:type="dxa"/>
+              <w:left w:w="100" w:type="dxa"/>
+              <w:bottom w:w="80" w:type="dxa"/>
+              <w:right w:w="100" w:type="dxa"/>
+            </w:tcMar>
+          </w:tcPr>
+          <w:p>
+            <w:pPr>
+              <w:spacing w:after="60"/>
+            </w:pPr>
+            <w:r>
+              <w:rPr>
+                <w:rFonts w:ascii="Times New Roman" w:hAnsi="Times New Roman"/>
+                <w:sz w:val="20"/>
+              </w:rPr>
+              <w:t>Setiap event memakai satu kategori.</w:t>
             </w:r>
           </w:p>
         </w:tc>
@@ -6035,7 +6426,7 @@
         <w:jc w:val="both"/>
       </w:pPr>
       <w:r>
-        <w:t>Status awal Event adalah diajukan. Admin dapat mengubah diajukan menjadi disetujui atau ditolak. Hanya event disetujui yang dapat ditandai selesai oleh penyelenggara pemilik atau admin setelah jadwal date_time terlewati dan pelaksanaan dikonfirmasi berakhir. Event ditolak tidak langsung menjadi selesai; perubahan oleh pemilik mengajukannya kembali untuk moderasi. Semua transisi divalidasi EventService (US-EVENT-03, NFR-MOD-02).</w:t>
+        <w:t>Status awal Event adalah draft. Penyelenggara aktif dari organisasi verified dapat mengirim event menjadi menunggu_moderasi. Admin menyetujui atau menolak; penolakan wajib disertai alasan. Event ditolak dapat diperbaiki lalu diajukan ulang. Pemilik organisasi dapat membatalkan event menjadi dibatalkan. Status selesai digunakan sesudah end_at; perubahan otomatis dijadwalkan sebagai Should sesuai FR-EVT-07.</w:t>
       </w:r>
     </w:p>
     <w:p>
@@ -6049,7 +6440,7 @@
         <w:jc w:val="both"/>
       </w:pPr>
       <w:r>
-        <w:t>Operasi ubah (PUT) dan hapus (DELETE) pada Event hanya diizinkan untuk penyelenggara pemilik ketika status diajukan atau ditolak. Backend memvalidasi organizer_id dari akun yang sedang login; perubahan event ditolak mengajukannya kembali untuk moderasi. Listing publik hanya menampilkan event berstatus disetujui (US-EVENT-04).</w:t>
+        <w:t>Operasi ubah (PUT) dibatasi pada penyelenggara dari organisasi pemilik; identitas dan organization_id diperiksa backend. Draft dan event ditolak dapat diedit lalu dikirim melalui aksi submit. Pembatalan menggunakan PATCH /events/:id/cancel agar riwayat dipertahankan. Edit data penting event disetujui memicu moderasi ulang dan notifikasi peserta sebagai kebutuhan Should. Listing publik hanya disetujui.</w:t>
       </w:r>
     </w:p>
     <w:p>
@@ -6063,7 +6454,7 @@
         <w:jc w:val="both"/>
       </w:pPr>
       <w:r>
-        <w:t>Kuota Event wajib lebih besar dari nol; jadwal date_time serta lokasi fisik atau tautan acara wajib diisi. Kolom category_id, date_time, status, dan organizer_id menjadi kandidat indeks agar kueri pencarian tetap stabil sesuai target NFR-SCAL-02.</w:t>
+        <w:t>Kuota Event wajib lebih besar dari nol. Waktu mulai start_at dan waktu selesai end_at wajib diisi, dengan end_at &gt; start_at; data event yang diajukan harus memiliki waktu mulai yang tidak berada di masa lalu. Lokasi atau tautan acara wajib. Kandidat indeks: status, category_id, start_at dan organization_id.</w:t>
       </w:r>
     </w:p>
     <w:p>
@@ -6090,27 +6481,29 @@
     </w:p>
     <w:p>
       <w:pPr>
-        <w:keepNext w:val="1"/>
+        <w:keepNext w:val="0"/>
+        <w:keepLines/>
         <w:pageBreakBefore w:val="0"/>
         <w:spacing w:after="160"/>
         <w:jc w:val="both"/>
       </w:pPr>
       <w:r>
-        <w:t>Gambar 1 merupakan hasil ekspor PNG dari Lucidchart. Ketiga entitas ditampilkan bersama relasi dan kardinalitasnya; rincian atribut dan aturan bisnis dijelaskan pada bagian sebelumnya.</w:t>
+        <w:t>Gambar 1 merupakan ekspor PNG dari Lucidchart revisi SRS. Keempat entitas dalam lingkup Auth dan Event ditampilkan beserta relasi utamanya. Rincian atribut, foreign key admin yang opsional, dan aturan verifikasi dijelaskan pada bagian sebelumnya.</w:t>
       </w:r>
     </w:p>
     <w:p>
       <w:pPr>
-        <w:keepNext w:val="1"/>
+        <w:keepNext/>
+        <w:keepLines/>
         <w:pageBreakBefore w:val="0"/>
-        <w:spacing w:before="120" w:after="120" w:line="240" w:lineRule="auto"/>
+        <w:spacing w:before="120" w:after="80" w:line="240" w:lineRule="auto"/>
         <w:jc w:val="center"/>
       </w:pPr>
       <w:r>
         <w:drawing>
           <wp:inline xmlns:a="http://schemas.openxmlformats.org/drawingml/2006/main" xmlns:pic="http://schemas.openxmlformats.org/drawingml/2006/picture">
-            <wp:extent cx="6035040" cy="2933002"/>
-            <wp:docPr id="1" name="Picture 1" descr="ERD v1 Auth dan Event dari ekspor asli Lucidchart, menampilkan User, EventCategory, Event serta relasi organizer, kategori dan moderator opsional."/>
+            <wp:extent cx="5852160" cy="4239360"/>
+            <wp:docPr id="1" name="Picture 1" descr="Diagram Lucidchart EventKu draft diselaraskan dengan SRS v2"/>
             <wp:cNvGraphicFramePr>
               <a:graphicFrameLocks noChangeAspect="1"/>
             </wp:cNvGraphicFramePr>
@@ -6118,12 +6511,11 @@
               <a:graphicData uri="http://schemas.openxmlformats.org/drawingml/2006/picture">
                 <pic:pic>
                   <pic:nvPicPr>
-                    <pic:cNvPr id="0" name="EventKu - Tugas Bambang 5803024019 - Paket Lengkap (Satu Dokumen) - 01 _ ERD v1 - Auth dan Event.png"/>
+                    <pic:cNvPr id="0" name="draft.png"/>
                     <pic:cNvPicPr/>
                   </pic:nvPicPr>
                   <pic:blipFill>
-                    <a:blip r:embed="rId5"/>
-                    <a:srcRect l="29682" t="19793" r="9004" b="27149"/>
+                    <a:blip r:embed="rId8"/>
                     <a:stretch>
                       <a:fillRect/>
                     </a:stretch>
@@ -6131,7 +6523,7 @@
                   <pic:spPr>
                     <a:xfrm>
                       <a:off x="0" y="0"/>
-                      <a:ext cx="6035040" cy="2933002"/>
+                      <a:ext cx="5852160" cy="4239360"/>
                     </a:xfrm>
                     <a:prstGeom prst="rect"/>
                   </pic:spPr>
@@ -6144,7 +6536,8 @@
     </w:p>
     <w:p>
       <w:pPr>
-        <w:keepNext w:val="1"/>
+        <w:keepNext w:val="0"/>
+        <w:keepLines/>
         <w:spacing w:after="120"/>
         <w:jc w:val="center"/>
       </w:pPr>
@@ -6169,7 +6562,21 @@
           <w:sz w:val="20"/>
           <w:szCs w:val="18"/>
         </w:rPr>
-        <w:t>Notasi crowfoot: setiap Event wajib memiliki satu penyelenggara dan satu kategori, serta boleh memiliki 0..1 admin moderator. Satu induk dapat memiliki 0..N Event. Garis putus-putus menunjukkan moderated_by yang opsional.</w:t>
+        <w:t>Notasi crowfoot: setiap Event memiliki satu organisasi, satu pengguna pembuat dan satu kategori. Satu organisasi dapat memiliki 0..N pengguna dan event. User.organization_id boleh NULL untuk mahasiswa/admin, tetapi wajib bagi penyelenggara. Event.moderated_by dan Organization.verified_by opsional dan mengacu pada User berperan admin.</w:t>
+      </w:r>
+    </w:p>
+    <w:p>
+      <w:pPr>
+        <w:keepNext w:val="0"/>
+        <w:spacing w:before="120" w:after="120"/>
+      </w:pPr>
+      <w:r>
+        <w:rPr>
+          <w:rFonts w:ascii="Times New Roman" w:hAnsi="Times New Roman"/>
+          <w:b w:val="0"/>
+          <w:sz w:val="20"/>
+        </w:rPr>
+        <w:t>Sumber rancangan: EventKu_2_SRS.docx versi 2. Diagram revisi tersedia di https://lucid.app/lucidchart/c1ed1ac4-eabd-423c-a2b8-d558d07f165d/edit</w:t>
       </w:r>
     </w:p>
     <w:p>
@@ -7031,7 +7438,7 @@
       <w:outlineLvl w:val="0"/>
     </w:pPr>
     <w:rPr>
-      <w:color w:val="2E74B5"/>
+      <w:color w:val="000000"/>
       <w:sz w:val="32"/>
       <w:szCs w:val="32"/>
     </w:rPr>
@@ -7046,7 +7453,7 @@
       <w:outlineLvl w:val="1"/>
     </w:pPr>
     <w:rPr>
-      <w:color w:val="2E74B5"/>
+      <w:color w:val="000000"/>
       <w:sz w:val="26"/>
       <w:szCs w:val="26"/>
     </w:rPr>
@@ -7061,7 +7468,7 @@
       <w:outlineLvl w:val="2"/>
     </w:pPr>
     <w:rPr>
-      <w:color w:val="1F4D78"/>
+      <w:color w:val="000000"/>
       <w:sz w:val="24"/>
       <w:szCs w:val="24"/>
     </w:rPr>
@@ -7078,7 +7485,7 @@
     <w:rPr>
       <w:i/>
       <w:iCs/>
-      <w:color w:val="2E74B5"/>
+      <w:color w:val="000000"/>
     </w:rPr>
   </w:style>
   <w:style w:type="paragraph" w:styleId="Judul5">
@@ -7091,7 +7498,7 @@
       <w:outlineLvl w:val="4"/>
     </w:pPr>
     <w:rPr>
-      <w:color w:val="2E74B5"/>
+      <w:color w:val="000000"/>
     </w:rPr>
   </w:style>
   <w:style w:type="paragraph" w:styleId="Judul6">
@@ -7104,7 +7511,7 @@
       <w:outlineLvl w:val="5"/>
     </w:pPr>
     <w:rPr>
-      <w:color w:val="1F4D78"/>
+      <w:color w:val="000000"/>
     </w:rPr>
   </w:style>
   <w:style w:type="character" w:default="1" w:styleId="FontParagrafDefault">
@@ -7139,6 +7546,7 @@
     <w:uiPriority w:val="10"/>
     <w:qFormat/>
     <w:rPr>
+      <w:color w:val="000000"/>
       <w:sz w:val="56"/>
       <w:szCs w:val="56"/>
     </w:rPr>

</xml_diff>